<commit_message>
CPP|Design pattern| Singleton design pattern and thread safety
</commit_message>
<xml_diff>
--- a/CPP/DesignPatterns/Introduction/DesignPatters.docx
+++ b/CPP/DesignPatterns/Introduction/DesignPatters.docx
@@ -4952,6 +4952,9 @@
     </w:p>
     <w:p>
       <w:r>
+        <w:rPr>
+          <w:noProof/>
+        </w:rPr>
         <w:drawing>
           <wp:inline distT="0" distB="0" distL="0" distR="0" wp14:anchorId="0FBE923C" wp14:editId="07C30C54">
             <wp:extent cx="6645910" cy="4828540"/>
@@ -5070,6 +5073,9 @@
         <w:ind w:firstLine="360"/>
       </w:pPr>
       <w:r>
+        <w:rPr>
+          <w:noProof/>
+        </w:rPr>
         <w:lastRenderedPageBreak/>
         <w:drawing>
           <wp:inline distT="0" distB="0" distL="0" distR="0" wp14:anchorId="30D739F6" wp14:editId="100FD2D9">
@@ -10172,26 +10178,6 @@
     </w:p>
     <w:p>
       <w:pPr>
-        <w:spacing w:after="0" w:line="240" w:lineRule="auto"/>
-        <w:ind w:firstLine="360"/>
-        <w:rPr>
-          <w:sz w:val="20"/>
-          <w:szCs w:val="20"/>
-        </w:rPr>
-      </w:pPr>
-    </w:p>
-    <w:p>
-      <w:pPr>
-        <w:spacing w:after="0" w:line="240" w:lineRule="auto"/>
-        <w:ind w:firstLine="360"/>
-        <w:rPr>
-          <w:sz w:val="20"/>
-          <w:szCs w:val="20"/>
-        </w:rPr>
-      </w:pPr>
-    </w:p>
-    <w:p>
-      <w:pPr>
         <w:pStyle w:val="ListParagraph"/>
         <w:numPr>
           <w:ilvl w:val="0"/>
@@ -10199,19 +10185,14 @@
         </w:numPr>
       </w:pPr>
       <w:r>
+        <w:lastRenderedPageBreak/>
         <w:t>Singleton</w:t>
       </w:r>
       <w:r>
         <w:t xml:space="preserve"> design pattern</w:t>
       </w:r>
       <w:r>
-        <w:t xml:space="preserve"> </w:t>
-      </w:r>
-      <w:r>
-        <w:t>(S</w:t>
-      </w:r>
-      <w:r>
-        <w:t>DP):</w:t>
+        <w:t xml:space="preserve"> (SDP):</w:t>
       </w:r>
     </w:p>
     <w:p>
@@ -10223,7 +10204,10 @@
         </w:numPr>
       </w:pPr>
       <w:r>
-        <w:t>Define a class that has only one instance and provides a global point of access that instance.</w:t>
+        <w:t>Define a class that has on</w:t>
+      </w:r>
+      <w:r>
+        <w:t>ly one instance and provides a global point of access that instance.</w:t>
       </w:r>
     </w:p>
     <w:p>
@@ -10443,6 +10427,9 @@
     <w:p/>
     <w:p>
       <w:r>
+        <w:rPr>
+          <w:noProof/>
+        </w:rPr>
         <w:drawing>
           <wp:inline distT="0" distB="0" distL="0" distR="0" wp14:anchorId="190E6E47" wp14:editId="1CE48DF8">
             <wp:extent cx="6645910" cy="2266950"/>
@@ -10608,14 +10595,20 @@
         <w:spacing w:after="0" w:line="240" w:lineRule="auto"/>
         <w:ind w:firstLine="360"/>
         <w:rPr>
-          <w:sz w:val="20"/>
-          <w:szCs w:val="20"/>
-        </w:rPr>
-      </w:pPr>
-      <w:r>
-        <w:rPr>
-          <w:sz w:val="20"/>
-          <w:szCs w:val="20"/>
+          <w:b/>
+          <w:bCs/>
+          <w:sz w:val="20"/>
+          <w:szCs w:val="20"/>
+          <w:u w:val="single"/>
+        </w:rPr>
+      </w:pPr>
+      <w:r>
+        <w:rPr>
+          <w:b/>
+          <w:bCs/>
+          <w:sz w:val="20"/>
+          <w:szCs w:val="20"/>
+          <w:u w:val="single"/>
         </w:rPr>
         <w:lastRenderedPageBreak/>
         <w:t>Code:</w:t>
@@ -10626,9 +10619,3624 @@
         <w:spacing w:after="0" w:line="240" w:lineRule="auto"/>
         <w:ind w:firstLine="360"/>
         <w:rPr>
-          <w:sz w:val="20"/>
-          <w:szCs w:val="20"/>
-        </w:rPr>
+          <w:b/>
+          <w:bCs/>
+          <w:sz w:val="20"/>
+          <w:szCs w:val="20"/>
+          <w:u w:val="single"/>
+        </w:rPr>
+      </w:pPr>
+      <w:proofErr w:type="spellStart"/>
+      <w:r>
+        <w:rPr>
+          <w:b/>
+          <w:bCs/>
+          <w:sz w:val="20"/>
+          <w:szCs w:val="20"/>
+          <w:u w:val="single"/>
+        </w:rPr>
+        <w:t>Singleton.h</w:t>
+      </w:r>
+      <w:proofErr w:type="spellEnd"/>
+    </w:p>
+    <w:p>
+      <w:pPr>
+        <w:spacing w:after="0" w:line="240" w:lineRule="auto"/>
+        <w:ind w:firstLine="360"/>
+        <w:rPr>
+          <w:sz w:val="20"/>
+          <w:szCs w:val="20"/>
+        </w:rPr>
+      </w:pPr>
+      <w:r>
+        <w:rPr>
+          <w:sz w:val="20"/>
+          <w:szCs w:val="20"/>
+        </w:rPr>
+        <w:t>#pragma once</w:t>
+      </w:r>
+    </w:p>
+    <w:p>
+      <w:pPr>
+        <w:spacing w:after="0" w:line="240" w:lineRule="auto"/>
+        <w:ind w:firstLine="360"/>
+        <w:rPr>
+          <w:sz w:val="20"/>
+          <w:szCs w:val="20"/>
+        </w:rPr>
+      </w:pPr>
+      <w:r>
+        <w:rPr>
+          <w:sz w:val="20"/>
+          <w:szCs w:val="20"/>
+        </w:rPr>
+        <w:t>#include &lt;iostream&gt;</w:t>
+      </w:r>
+    </w:p>
+    <w:p>
+      <w:pPr>
+        <w:spacing w:after="0" w:line="240" w:lineRule="auto"/>
+        <w:ind w:firstLine="360"/>
+        <w:rPr>
+          <w:sz w:val="20"/>
+          <w:szCs w:val="20"/>
+        </w:rPr>
+      </w:pPr>
+    </w:p>
+    <w:p>
+      <w:pPr>
+        <w:spacing w:after="0" w:line="240" w:lineRule="auto"/>
+        <w:ind w:firstLine="360"/>
+        <w:rPr>
+          <w:sz w:val="20"/>
+          <w:szCs w:val="20"/>
+        </w:rPr>
+      </w:pPr>
+      <w:r>
+        <w:rPr>
+          <w:sz w:val="20"/>
+          <w:szCs w:val="20"/>
+        </w:rPr>
+        <w:t xml:space="preserve">class </w:t>
+      </w:r>
+      <w:proofErr w:type="spellStart"/>
+      <w:r>
+        <w:rPr>
+          <w:sz w:val="20"/>
+          <w:szCs w:val="20"/>
+        </w:rPr>
+        <w:t>SingletonGameSetting</w:t>
+      </w:r>
+      <w:proofErr w:type="spellEnd"/>
+    </w:p>
+    <w:p>
+      <w:pPr>
+        <w:spacing w:after="0" w:line="240" w:lineRule="auto"/>
+        <w:ind w:firstLine="360"/>
+        <w:rPr>
+          <w:sz w:val="20"/>
+          <w:szCs w:val="20"/>
+        </w:rPr>
+      </w:pPr>
+      <w:r>
+        <w:rPr>
+          <w:sz w:val="20"/>
+          <w:szCs w:val="20"/>
+        </w:rPr>
+        <w:t>{</w:t>
+      </w:r>
+    </w:p>
+    <w:p>
+      <w:pPr>
+        <w:spacing w:after="0" w:line="240" w:lineRule="auto"/>
+        <w:ind w:firstLine="360"/>
+        <w:rPr>
+          <w:sz w:val="20"/>
+          <w:szCs w:val="20"/>
+        </w:rPr>
+      </w:pPr>
+      <w:r>
+        <w:rPr>
+          <w:sz w:val="20"/>
+          <w:szCs w:val="20"/>
+        </w:rPr>
+        <w:tab/>
+        <w:t xml:space="preserve">static </w:t>
+      </w:r>
+      <w:proofErr w:type="spellStart"/>
+      <w:r>
+        <w:rPr>
+          <w:sz w:val="20"/>
+          <w:szCs w:val="20"/>
+        </w:rPr>
+        <w:t>SingletonGameSetting</w:t>
+      </w:r>
+      <w:proofErr w:type="spellEnd"/>
+      <w:r>
+        <w:rPr>
+          <w:sz w:val="20"/>
+          <w:szCs w:val="20"/>
+        </w:rPr>
+        <w:t xml:space="preserve">* </w:t>
+      </w:r>
+      <w:proofErr w:type="spellStart"/>
+      <w:r>
+        <w:rPr>
+          <w:sz w:val="20"/>
+          <w:szCs w:val="20"/>
+        </w:rPr>
+        <w:t>gameSetting</w:t>
+      </w:r>
+      <w:proofErr w:type="spellEnd"/>
+      <w:r>
+        <w:rPr>
+          <w:sz w:val="20"/>
+          <w:szCs w:val="20"/>
+        </w:rPr>
+        <w:t>; //1. Compulsory required static member variable</w:t>
+      </w:r>
+    </w:p>
+    <w:p>
+      <w:pPr>
+        <w:spacing w:after="0" w:line="240" w:lineRule="auto"/>
+        <w:ind w:firstLine="360"/>
+        <w:rPr>
+          <w:sz w:val="20"/>
+          <w:szCs w:val="20"/>
+        </w:rPr>
+      </w:pPr>
+      <w:r>
+        <w:rPr>
+          <w:sz w:val="20"/>
+          <w:szCs w:val="20"/>
+        </w:rPr>
+        <w:tab/>
+        <w:t>int brightness;</w:t>
+      </w:r>
+    </w:p>
+    <w:p>
+      <w:pPr>
+        <w:spacing w:after="0" w:line="240" w:lineRule="auto"/>
+        <w:ind w:firstLine="360"/>
+        <w:rPr>
+          <w:sz w:val="20"/>
+          <w:szCs w:val="20"/>
+        </w:rPr>
+      </w:pPr>
+      <w:r>
+        <w:rPr>
+          <w:sz w:val="20"/>
+          <w:szCs w:val="20"/>
+        </w:rPr>
+        <w:tab/>
+        <w:t>int width;</w:t>
+      </w:r>
+    </w:p>
+    <w:p>
+      <w:pPr>
+        <w:spacing w:after="0" w:line="240" w:lineRule="auto"/>
+        <w:ind w:firstLine="360"/>
+        <w:rPr>
+          <w:sz w:val="20"/>
+          <w:szCs w:val="20"/>
+        </w:rPr>
+      </w:pPr>
+      <w:r>
+        <w:rPr>
+          <w:sz w:val="20"/>
+          <w:szCs w:val="20"/>
+        </w:rPr>
+        <w:tab/>
+        <w:t>int height;</w:t>
+      </w:r>
+    </w:p>
+    <w:p>
+      <w:pPr>
+        <w:spacing w:after="0" w:line="240" w:lineRule="auto"/>
+        <w:ind w:firstLine="360"/>
+        <w:rPr>
+          <w:sz w:val="20"/>
+          <w:szCs w:val="20"/>
+        </w:rPr>
+      </w:pPr>
+      <w:r>
+        <w:rPr>
+          <w:sz w:val="20"/>
+          <w:szCs w:val="20"/>
+        </w:rPr>
+        <w:tab/>
+      </w:r>
+      <w:proofErr w:type="spellStart"/>
+      <w:proofErr w:type="gramStart"/>
+      <w:r>
+        <w:rPr>
+          <w:sz w:val="20"/>
+          <w:szCs w:val="20"/>
+        </w:rPr>
+        <w:t>SingletonGameSetting</w:t>
+      </w:r>
+      <w:proofErr w:type="spellEnd"/>
+      <w:r>
+        <w:rPr>
+          <w:sz w:val="20"/>
+          <w:szCs w:val="20"/>
+        </w:rPr>
+        <w:t>() :</w:t>
+      </w:r>
+      <w:proofErr w:type="gramEnd"/>
+      <w:r>
+        <w:rPr>
+          <w:sz w:val="20"/>
+          <w:szCs w:val="20"/>
+        </w:rPr>
+        <w:t xml:space="preserve"> </w:t>
+      </w:r>
+      <w:proofErr w:type="gramStart"/>
+      <w:r>
+        <w:rPr>
+          <w:sz w:val="20"/>
+          <w:szCs w:val="20"/>
+        </w:rPr>
+        <w:t>brightness(</w:t>
+      </w:r>
+      <w:proofErr w:type="gramEnd"/>
+      <w:r>
+        <w:rPr>
+          <w:sz w:val="20"/>
+          <w:szCs w:val="20"/>
+        </w:rPr>
+        <w:t xml:space="preserve">75), </w:t>
+      </w:r>
+      <w:proofErr w:type="gramStart"/>
+      <w:r>
+        <w:rPr>
+          <w:sz w:val="20"/>
+          <w:szCs w:val="20"/>
+        </w:rPr>
+        <w:t>width(</w:t>
+      </w:r>
+      <w:proofErr w:type="gramEnd"/>
+      <w:r>
+        <w:rPr>
+          <w:sz w:val="20"/>
+          <w:szCs w:val="20"/>
+        </w:rPr>
+        <w:t xml:space="preserve">512), </w:t>
+      </w:r>
+      <w:proofErr w:type="gramStart"/>
+      <w:r>
+        <w:rPr>
+          <w:sz w:val="20"/>
+          <w:szCs w:val="20"/>
+        </w:rPr>
+        <w:t>height(</w:t>
+      </w:r>
+      <w:proofErr w:type="gramEnd"/>
+      <w:r>
+        <w:rPr>
+          <w:sz w:val="20"/>
+          <w:szCs w:val="20"/>
+        </w:rPr>
+        <w:t>1080) {} //2. Private constructor mandatory</w:t>
+      </w:r>
+    </w:p>
+    <w:p>
+      <w:pPr>
+        <w:spacing w:after="0" w:line="240" w:lineRule="auto"/>
+        <w:ind w:firstLine="360"/>
+        <w:rPr>
+          <w:sz w:val="20"/>
+          <w:szCs w:val="20"/>
+        </w:rPr>
+      </w:pPr>
+      <w:r>
+        <w:rPr>
+          <w:sz w:val="20"/>
+          <w:szCs w:val="20"/>
+        </w:rPr>
+        <w:t>public:</w:t>
+      </w:r>
+    </w:p>
+    <w:p>
+      <w:pPr>
+        <w:spacing w:after="0" w:line="240" w:lineRule="auto"/>
+        <w:ind w:firstLine="360"/>
+        <w:rPr>
+          <w:sz w:val="20"/>
+          <w:szCs w:val="20"/>
+        </w:rPr>
+      </w:pPr>
+      <w:r>
+        <w:rPr>
+          <w:sz w:val="20"/>
+          <w:szCs w:val="20"/>
+        </w:rPr>
+        <w:tab/>
+        <w:t xml:space="preserve">static </w:t>
+      </w:r>
+      <w:proofErr w:type="spellStart"/>
+      <w:r>
+        <w:rPr>
+          <w:sz w:val="20"/>
+          <w:szCs w:val="20"/>
+        </w:rPr>
+        <w:t>SingletonGameSetting</w:t>
+      </w:r>
+      <w:proofErr w:type="spellEnd"/>
+      <w:r>
+        <w:rPr>
+          <w:sz w:val="20"/>
+          <w:szCs w:val="20"/>
+        </w:rPr>
+        <w:t xml:space="preserve">* </w:t>
+      </w:r>
+      <w:proofErr w:type="spellStart"/>
+      <w:proofErr w:type="gramStart"/>
+      <w:r>
+        <w:rPr>
+          <w:sz w:val="20"/>
+          <w:szCs w:val="20"/>
+        </w:rPr>
+        <w:t>getInstance</w:t>
+      </w:r>
+      <w:proofErr w:type="spellEnd"/>
+      <w:r>
+        <w:rPr>
+          <w:sz w:val="20"/>
+          <w:szCs w:val="20"/>
+        </w:rPr>
+        <w:t>(</w:t>
+      </w:r>
+      <w:proofErr w:type="gramEnd"/>
+      <w:r>
+        <w:rPr>
+          <w:sz w:val="20"/>
+          <w:szCs w:val="20"/>
+        </w:rPr>
+        <w:t>)</w:t>
+      </w:r>
+    </w:p>
+    <w:p>
+      <w:pPr>
+        <w:spacing w:after="0" w:line="240" w:lineRule="auto"/>
+        <w:ind w:firstLine="360"/>
+        <w:rPr>
+          <w:sz w:val="20"/>
+          <w:szCs w:val="20"/>
+        </w:rPr>
+      </w:pPr>
+      <w:r>
+        <w:rPr>
+          <w:sz w:val="20"/>
+          <w:szCs w:val="20"/>
+        </w:rPr>
+        <w:tab/>
+        <w:t>{</w:t>
+      </w:r>
+    </w:p>
+    <w:p>
+      <w:pPr>
+        <w:spacing w:after="0" w:line="240" w:lineRule="auto"/>
+        <w:ind w:firstLine="360"/>
+        <w:rPr>
+          <w:sz w:val="20"/>
+          <w:szCs w:val="20"/>
+        </w:rPr>
+      </w:pPr>
+      <w:r>
+        <w:rPr>
+          <w:sz w:val="20"/>
+          <w:szCs w:val="20"/>
+        </w:rPr>
+        <w:tab/>
+      </w:r>
+      <w:r>
+        <w:rPr>
+          <w:sz w:val="20"/>
+          <w:szCs w:val="20"/>
+        </w:rPr>
+        <w:tab/>
+        <w:t>if (</w:t>
+      </w:r>
+      <w:proofErr w:type="spellStart"/>
+      <w:r>
+        <w:rPr>
+          <w:sz w:val="20"/>
+          <w:szCs w:val="20"/>
+        </w:rPr>
+        <w:t>gameSetting</w:t>
+      </w:r>
+      <w:proofErr w:type="spellEnd"/>
+      <w:r>
+        <w:rPr>
+          <w:sz w:val="20"/>
+          <w:szCs w:val="20"/>
+        </w:rPr>
+        <w:t xml:space="preserve"> == </w:t>
+      </w:r>
+      <w:proofErr w:type="spellStart"/>
+      <w:r>
+        <w:rPr>
+          <w:sz w:val="20"/>
+          <w:szCs w:val="20"/>
+        </w:rPr>
+        <w:t>nullptr</w:t>
+      </w:r>
+      <w:proofErr w:type="spellEnd"/>
+      <w:r>
+        <w:rPr>
+          <w:sz w:val="20"/>
+          <w:szCs w:val="20"/>
+        </w:rPr>
+        <w:t>)</w:t>
+      </w:r>
+    </w:p>
+    <w:p>
+      <w:pPr>
+        <w:spacing w:after="0" w:line="240" w:lineRule="auto"/>
+        <w:ind w:firstLine="360"/>
+        <w:rPr>
+          <w:sz w:val="20"/>
+          <w:szCs w:val="20"/>
+        </w:rPr>
+      </w:pPr>
+      <w:r>
+        <w:rPr>
+          <w:sz w:val="20"/>
+          <w:szCs w:val="20"/>
+        </w:rPr>
+        <w:tab/>
+      </w:r>
+      <w:r>
+        <w:rPr>
+          <w:sz w:val="20"/>
+          <w:szCs w:val="20"/>
+        </w:rPr>
+        <w:tab/>
+        <w:t>{</w:t>
+      </w:r>
+    </w:p>
+    <w:p>
+      <w:pPr>
+        <w:spacing w:after="0" w:line="240" w:lineRule="auto"/>
+        <w:ind w:firstLine="360"/>
+        <w:rPr>
+          <w:sz w:val="20"/>
+          <w:szCs w:val="20"/>
+        </w:rPr>
+      </w:pPr>
+      <w:r>
+        <w:rPr>
+          <w:sz w:val="20"/>
+          <w:szCs w:val="20"/>
+        </w:rPr>
+        <w:tab/>
+      </w:r>
+      <w:r>
+        <w:rPr>
+          <w:sz w:val="20"/>
+          <w:szCs w:val="20"/>
+        </w:rPr>
+        <w:tab/>
+      </w:r>
+      <w:r>
+        <w:rPr>
+          <w:sz w:val="20"/>
+          <w:szCs w:val="20"/>
+        </w:rPr>
+        <w:tab/>
+      </w:r>
+      <w:proofErr w:type="spellStart"/>
+      <w:r>
+        <w:rPr>
+          <w:sz w:val="20"/>
+          <w:szCs w:val="20"/>
+        </w:rPr>
+        <w:t>gameSetting</w:t>
+      </w:r>
+      <w:proofErr w:type="spellEnd"/>
+      <w:r>
+        <w:rPr>
+          <w:sz w:val="20"/>
+          <w:szCs w:val="20"/>
+        </w:rPr>
+        <w:t xml:space="preserve"> = new </w:t>
+      </w:r>
+      <w:proofErr w:type="spellStart"/>
+      <w:proofErr w:type="gramStart"/>
+      <w:r>
+        <w:rPr>
+          <w:sz w:val="20"/>
+          <w:szCs w:val="20"/>
+        </w:rPr>
+        <w:t>SingletonGameSetting</w:t>
+      </w:r>
+      <w:proofErr w:type="spellEnd"/>
+      <w:r>
+        <w:rPr>
+          <w:sz w:val="20"/>
+          <w:szCs w:val="20"/>
+        </w:rPr>
+        <w:t>(</w:t>
+      </w:r>
+      <w:proofErr w:type="gramEnd"/>
+      <w:r>
+        <w:rPr>
+          <w:sz w:val="20"/>
+          <w:szCs w:val="20"/>
+        </w:rPr>
+        <w:t>);</w:t>
+      </w:r>
+    </w:p>
+    <w:p>
+      <w:pPr>
+        <w:spacing w:after="0" w:line="240" w:lineRule="auto"/>
+        <w:ind w:firstLine="360"/>
+        <w:rPr>
+          <w:sz w:val="20"/>
+          <w:szCs w:val="20"/>
+        </w:rPr>
+      </w:pPr>
+      <w:r>
+        <w:rPr>
+          <w:sz w:val="20"/>
+          <w:szCs w:val="20"/>
+        </w:rPr>
+        <w:tab/>
+      </w:r>
+      <w:r>
+        <w:rPr>
+          <w:sz w:val="20"/>
+          <w:szCs w:val="20"/>
+        </w:rPr>
+        <w:tab/>
+        <w:t>}</w:t>
+      </w:r>
+    </w:p>
+    <w:p>
+      <w:pPr>
+        <w:spacing w:after="0" w:line="240" w:lineRule="auto"/>
+        <w:ind w:firstLine="360"/>
+        <w:rPr>
+          <w:sz w:val="20"/>
+          <w:szCs w:val="20"/>
+        </w:rPr>
+      </w:pPr>
+      <w:r>
+        <w:rPr>
+          <w:sz w:val="20"/>
+          <w:szCs w:val="20"/>
+        </w:rPr>
+        <w:tab/>
+      </w:r>
+      <w:r>
+        <w:rPr>
+          <w:sz w:val="20"/>
+          <w:szCs w:val="20"/>
+        </w:rPr>
+        <w:tab/>
+        <w:t xml:space="preserve">return </w:t>
+      </w:r>
+      <w:proofErr w:type="spellStart"/>
+      <w:r>
+        <w:rPr>
+          <w:sz w:val="20"/>
+          <w:szCs w:val="20"/>
+        </w:rPr>
+        <w:t>gameSetting</w:t>
+      </w:r>
+      <w:proofErr w:type="spellEnd"/>
+      <w:r>
+        <w:rPr>
+          <w:sz w:val="20"/>
+          <w:szCs w:val="20"/>
+        </w:rPr>
+        <w:t>;</w:t>
+      </w:r>
+    </w:p>
+    <w:p>
+      <w:pPr>
+        <w:spacing w:after="0" w:line="240" w:lineRule="auto"/>
+        <w:ind w:firstLine="360"/>
+        <w:rPr>
+          <w:sz w:val="20"/>
+          <w:szCs w:val="20"/>
+        </w:rPr>
+      </w:pPr>
+      <w:r>
+        <w:rPr>
+          <w:sz w:val="20"/>
+          <w:szCs w:val="20"/>
+        </w:rPr>
+        <w:tab/>
+        <w:t>}</w:t>
+      </w:r>
+    </w:p>
+    <w:p>
+      <w:pPr>
+        <w:spacing w:after="0" w:line="240" w:lineRule="auto"/>
+        <w:ind w:firstLine="360"/>
+        <w:rPr>
+          <w:sz w:val="20"/>
+          <w:szCs w:val="20"/>
+        </w:rPr>
+      </w:pPr>
+      <w:r>
+        <w:rPr>
+          <w:sz w:val="20"/>
+          <w:szCs w:val="20"/>
+        </w:rPr>
+        <w:tab/>
+        <w:t xml:space="preserve">int </w:t>
+      </w:r>
+      <w:proofErr w:type="spellStart"/>
+      <w:proofErr w:type="gramStart"/>
+      <w:r>
+        <w:rPr>
+          <w:sz w:val="20"/>
+          <w:szCs w:val="20"/>
+        </w:rPr>
+        <w:t>getBrightness</w:t>
+      </w:r>
+      <w:proofErr w:type="spellEnd"/>
+      <w:r>
+        <w:rPr>
+          <w:sz w:val="20"/>
+          <w:szCs w:val="20"/>
+        </w:rPr>
+        <w:t>(</w:t>
+      </w:r>
+      <w:proofErr w:type="gramEnd"/>
+      <w:r>
+        <w:rPr>
+          <w:sz w:val="20"/>
+          <w:szCs w:val="20"/>
+        </w:rPr>
+        <w:t xml:space="preserve">) </w:t>
+      </w:r>
+      <w:proofErr w:type="spellStart"/>
+      <w:r>
+        <w:rPr>
+          <w:sz w:val="20"/>
+          <w:szCs w:val="20"/>
+        </w:rPr>
+        <w:t>const</w:t>
+      </w:r>
+      <w:proofErr w:type="spellEnd"/>
+      <w:r>
+        <w:rPr>
+          <w:sz w:val="20"/>
+          <w:szCs w:val="20"/>
+        </w:rPr>
+        <w:t xml:space="preserve"> </w:t>
+      </w:r>
+      <w:proofErr w:type="gramStart"/>
+      <w:r>
+        <w:rPr>
+          <w:sz w:val="20"/>
+          <w:szCs w:val="20"/>
+        </w:rPr>
+        <w:t>{ return</w:t>
+      </w:r>
+      <w:proofErr w:type="gramEnd"/>
+      <w:r>
+        <w:rPr>
+          <w:sz w:val="20"/>
+          <w:szCs w:val="20"/>
+        </w:rPr>
+        <w:t xml:space="preserve"> brightness</w:t>
+      </w:r>
+      <w:proofErr w:type="gramStart"/>
+      <w:r>
+        <w:rPr>
+          <w:sz w:val="20"/>
+          <w:szCs w:val="20"/>
+        </w:rPr>
+        <w:t>; }</w:t>
+      </w:r>
+      <w:proofErr w:type="gramEnd"/>
+    </w:p>
+    <w:p>
+      <w:pPr>
+        <w:spacing w:after="0" w:line="240" w:lineRule="auto"/>
+        <w:ind w:firstLine="360"/>
+        <w:rPr>
+          <w:sz w:val="20"/>
+          <w:szCs w:val="20"/>
+        </w:rPr>
+      </w:pPr>
+      <w:r>
+        <w:rPr>
+          <w:sz w:val="20"/>
+          <w:szCs w:val="20"/>
+        </w:rPr>
+        <w:tab/>
+        <w:t xml:space="preserve">int </w:t>
+      </w:r>
+      <w:proofErr w:type="spellStart"/>
+      <w:proofErr w:type="gramStart"/>
+      <w:r>
+        <w:rPr>
+          <w:sz w:val="20"/>
+          <w:szCs w:val="20"/>
+        </w:rPr>
+        <w:t>getWidth</w:t>
+      </w:r>
+      <w:proofErr w:type="spellEnd"/>
+      <w:r>
+        <w:rPr>
+          <w:sz w:val="20"/>
+          <w:szCs w:val="20"/>
+        </w:rPr>
+        <w:t>(</w:t>
+      </w:r>
+      <w:proofErr w:type="gramEnd"/>
+      <w:r>
+        <w:rPr>
+          <w:sz w:val="20"/>
+          <w:szCs w:val="20"/>
+        </w:rPr>
+        <w:t xml:space="preserve">) </w:t>
+      </w:r>
+      <w:proofErr w:type="spellStart"/>
+      <w:r>
+        <w:rPr>
+          <w:sz w:val="20"/>
+          <w:szCs w:val="20"/>
+        </w:rPr>
+        <w:t>const</w:t>
+      </w:r>
+      <w:proofErr w:type="spellEnd"/>
+      <w:r>
+        <w:rPr>
+          <w:sz w:val="20"/>
+          <w:szCs w:val="20"/>
+        </w:rPr>
+        <w:t xml:space="preserve"> </w:t>
+      </w:r>
+      <w:proofErr w:type="gramStart"/>
+      <w:r>
+        <w:rPr>
+          <w:sz w:val="20"/>
+          <w:szCs w:val="20"/>
+        </w:rPr>
+        <w:t>{ return</w:t>
+      </w:r>
+      <w:proofErr w:type="gramEnd"/>
+      <w:r>
+        <w:rPr>
+          <w:sz w:val="20"/>
+          <w:szCs w:val="20"/>
+        </w:rPr>
+        <w:t xml:space="preserve"> width</w:t>
+      </w:r>
+      <w:proofErr w:type="gramStart"/>
+      <w:r>
+        <w:rPr>
+          <w:sz w:val="20"/>
+          <w:szCs w:val="20"/>
+        </w:rPr>
+        <w:t>; }</w:t>
+      </w:r>
+      <w:proofErr w:type="gramEnd"/>
+    </w:p>
+    <w:p>
+      <w:pPr>
+        <w:spacing w:after="0" w:line="240" w:lineRule="auto"/>
+        <w:ind w:firstLine="360"/>
+        <w:rPr>
+          <w:sz w:val="20"/>
+          <w:szCs w:val="20"/>
+        </w:rPr>
+      </w:pPr>
+      <w:r>
+        <w:rPr>
+          <w:sz w:val="20"/>
+          <w:szCs w:val="20"/>
+        </w:rPr>
+        <w:tab/>
+        <w:t xml:space="preserve">int </w:t>
+      </w:r>
+      <w:proofErr w:type="spellStart"/>
+      <w:proofErr w:type="gramStart"/>
+      <w:r>
+        <w:rPr>
+          <w:sz w:val="20"/>
+          <w:szCs w:val="20"/>
+        </w:rPr>
+        <w:t>getHeight</w:t>
+      </w:r>
+      <w:proofErr w:type="spellEnd"/>
+      <w:r>
+        <w:rPr>
+          <w:sz w:val="20"/>
+          <w:szCs w:val="20"/>
+        </w:rPr>
+        <w:t>(</w:t>
+      </w:r>
+      <w:proofErr w:type="gramEnd"/>
+      <w:r>
+        <w:rPr>
+          <w:sz w:val="20"/>
+          <w:szCs w:val="20"/>
+        </w:rPr>
+        <w:t xml:space="preserve">) </w:t>
+      </w:r>
+      <w:proofErr w:type="spellStart"/>
+      <w:r>
+        <w:rPr>
+          <w:sz w:val="20"/>
+          <w:szCs w:val="20"/>
+        </w:rPr>
+        <w:t>const</w:t>
+      </w:r>
+      <w:proofErr w:type="spellEnd"/>
+      <w:r>
+        <w:rPr>
+          <w:sz w:val="20"/>
+          <w:szCs w:val="20"/>
+        </w:rPr>
+        <w:t xml:space="preserve"> </w:t>
+      </w:r>
+      <w:proofErr w:type="gramStart"/>
+      <w:r>
+        <w:rPr>
+          <w:sz w:val="20"/>
+          <w:szCs w:val="20"/>
+        </w:rPr>
+        <w:t>{ return</w:t>
+      </w:r>
+      <w:proofErr w:type="gramEnd"/>
+      <w:r>
+        <w:rPr>
+          <w:sz w:val="20"/>
+          <w:szCs w:val="20"/>
+        </w:rPr>
+        <w:t xml:space="preserve"> height</w:t>
+      </w:r>
+      <w:proofErr w:type="gramStart"/>
+      <w:r>
+        <w:rPr>
+          <w:sz w:val="20"/>
+          <w:szCs w:val="20"/>
+        </w:rPr>
+        <w:t>; }</w:t>
+      </w:r>
+      <w:proofErr w:type="gramEnd"/>
+    </w:p>
+    <w:p>
+      <w:pPr>
+        <w:spacing w:after="0" w:line="240" w:lineRule="auto"/>
+        <w:ind w:firstLine="360"/>
+        <w:rPr>
+          <w:sz w:val="20"/>
+          <w:szCs w:val="20"/>
+        </w:rPr>
+      </w:pPr>
+      <w:r>
+        <w:rPr>
+          <w:sz w:val="20"/>
+          <w:szCs w:val="20"/>
+        </w:rPr>
+        <w:tab/>
+        <w:t xml:space="preserve">void </w:t>
+      </w:r>
+      <w:proofErr w:type="spellStart"/>
+      <w:proofErr w:type="gramStart"/>
+      <w:r>
+        <w:rPr>
+          <w:sz w:val="20"/>
+          <w:szCs w:val="20"/>
+        </w:rPr>
+        <w:t>setBrightness</w:t>
+      </w:r>
+      <w:proofErr w:type="spellEnd"/>
+      <w:r>
+        <w:rPr>
+          <w:sz w:val="20"/>
+          <w:szCs w:val="20"/>
+        </w:rPr>
+        <w:t>(</w:t>
+      </w:r>
+      <w:proofErr w:type="gramEnd"/>
+      <w:r>
+        <w:rPr>
+          <w:sz w:val="20"/>
+          <w:szCs w:val="20"/>
+        </w:rPr>
+        <w:t xml:space="preserve">int b) </w:t>
+      </w:r>
+      <w:proofErr w:type="gramStart"/>
+      <w:r>
+        <w:rPr>
+          <w:sz w:val="20"/>
+          <w:szCs w:val="20"/>
+        </w:rPr>
+        <w:t>{ brightness</w:t>
+      </w:r>
+      <w:proofErr w:type="gramEnd"/>
+      <w:r>
+        <w:rPr>
+          <w:sz w:val="20"/>
+          <w:szCs w:val="20"/>
+        </w:rPr>
+        <w:t xml:space="preserve"> = b</w:t>
+      </w:r>
+      <w:proofErr w:type="gramStart"/>
+      <w:r>
+        <w:rPr>
+          <w:sz w:val="20"/>
+          <w:szCs w:val="20"/>
+        </w:rPr>
+        <w:t>; }</w:t>
+      </w:r>
+      <w:proofErr w:type="gramEnd"/>
+    </w:p>
+    <w:p>
+      <w:pPr>
+        <w:spacing w:after="0" w:line="240" w:lineRule="auto"/>
+        <w:ind w:firstLine="360"/>
+        <w:rPr>
+          <w:sz w:val="20"/>
+          <w:szCs w:val="20"/>
+        </w:rPr>
+      </w:pPr>
+      <w:r>
+        <w:rPr>
+          <w:sz w:val="20"/>
+          <w:szCs w:val="20"/>
+        </w:rPr>
+        <w:tab/>
+        <w:t xml:space="preserve">void </w:t>
+      </w:r>
+      <w:proofErr w:type="spellStart"/>
+      <w:proofErr w:type="gramStart"/>
+      <w:r>
+        <w:rPr>
+          <w:sz w:val="20"/>
+          <w:szCs w:val="20"/>
+        </w:rPr>
+        <w:t>setWidth</w:t>
+      </w:r>
+      <w:proofErr w:type="spellEnd"/>
+      <w:r>
+        <w:rPr>
+          <w:sz w:val="20"/>
+          <w:szCs w:val="20"/>
+        </w:rPr>
+        <w:t>(</w:t>
+      </w:r>
+      <w:proofErr w:type="gramEnd"/>
+      <w:r>
+        <w:rPr>
+          <w:sz w:val="20"/>
+          <w:szCs w:val="20"/>
+        </w:rPr>
+        <w:t xml:space="preserve">int w) </w:t>
+      </w:r>
+      <w:proofErr w:type="gramStart"/>
+      <w:r>
+        <w:rPr>
+          <w:sz w:val="20"/>
+          <w:szCs w:val="20"/>
+        </w:rPr>
+        <w:t>{ width</w:t>
+      </w:r>
+      <w:proofErr w:type="gramEnd"/>
+      <w:r>
+        <w:rPr>
+          <w:sz w:val="20"/>
+          <w:szCs w:val="20"/>
+        </w:rPr>
+        <w:t xml:space="preserve"> = w</w:t>
+      </w:r>
+      <w:proofErr w:type="gramStart"/>
+      <w:r>
+        <w:rPr>
+          <w:sz w:val="20"/>
+          <w:szCs w:val="20"/>
+        </w:rPr>
+        <w:t>; }</w:t>
+      </w:r>
+      <w:proofErr w:type="gramEnd"/>
+    </w:p>
+    <w:p>
+      <w:pPr>
+        <w:spacing w:after="0" w:line="240" w:lineRule="auto"/>
+        <w:ind w:firstLine="360"/>
+        <w:rPr>
+          <w:sz w:val="20"/>
+          <w:szCs w:val="20"/>
+        </w:rPr>
+      </w:pPr>
+      <w:r>
+        <w:rPr>
+          <w:sz w:val="20"/>
+          <w:szCs w:val="20"/>
+        </w:rPr>
+        <w:tab/>
+        <w:t xml:space="preserve">void </w:t>
+      </w:r>
+      <w:proofErr w:type="spellStart"/>
+      <w:proofErr w:type="gramStart"/>
+      <w:r>
+        <w:rPr>
+          <w:sz w:val="20"/>
+          <w:szCs w:val="20"/>
+        </w:rPr>
+        <w:t>setHeight</w:t>
+      </w:r>
+      <w:proofErr w:type="spellEnd"/>
+      <w:r>
+        <w:rPr>
+          <w:sz w:val="20"/>
+          <w:szCs w:val="20"/>
+        </w:rPr>
+        <w:t>(</w:t>
+      </w:r>
+      <w:proofErr w:type="gramEnd"/>
+      <w:r>
+        <w:rPr>
+          <w:sz w:val="20"/>
+          <w:szCs w:val="20"/>
+        </w:rPr>
+        <w:t xml:space="preserve">int h) </w:t>
+      </w:r>
+      <w:proofErr w:type="gramStart"/>
+      <w:r>
+        <w:rPr>
+          <w:sz w:val="20"/>
+          <w:szCs w:val="20"/>
+        </w:rPr>
+        <w:t>{ height</w:t>
+      </w:r>
+      <w:proofErr w:type="gramEnd"/>
+      <w:r>
+        <w:rPr>
+          <w:sz w:val="20"/>
+          <w:szCs w:val="20"/>
+        </w:rPr>
+        <w:t xml:space="preserve"> = h</w:t>
+      </w:r>
+      <w:proofErr w:type="gramStart"/>
+      <w:r>
+        <w:rPr>
+          <w:sz w:val="20"/>
+          <w:szCs w:val="20"/>
+        </w:rPr>
+        <w:t>; }</w:t>
+      </w:r>
+      <w:proofErr w:type="gramEnd"/>
+      <w:r>
+        <w:rPr>
+          <w:sz w:val="20"/>
+          <w:szCs w:val="20"/>
+        </w:rPr>
+        <w:t xml:space="preserve"> </w:t>
+      </w:r>
+    </w:p>
+    <w:p>
+      <w:pPr>
+        <w:spacing w:after="0" w:line="240" w:lineRule="auto"/>
+        <w:ind w:firstLine="360"/>
+        <w:rPr>
+          <w:sz w:val="20"/>
+          <w:szCs w:val="20"/>
+        </w:rPr>
+      </w:pPr>
+    </w:p>
+    <w:p>
+      <w:pPr>
+        <w:spacing w:after="0" w:line="240" w:lineRule="auto"/>
+        <w:ind w:firstLine="360"/>
+        <w:rPr>
+          <w:sz w:val="20"/>
+          <w:szCs w:val="20"/>
+        </w:rPr>
+      </w:pPr>
+      <w:r>
+        <w:rPr>
+          <w:sz w:val="20"/>
+          <w:szCs w:val="20"/>
+        </w:rPr>
+        <w:tab/>
+        <w:t xml:space="preserve">void </w:t>
+      </w:r>
+      <w:proofErr w:type="spellStart"/>
+      <w:proofErr w:type="gramStart"/>
+      <w:r>
+        <w:rPr>
+          <w:sz w:val="20"/>
+          <w:szCs w:val="20"/>
+        </w:rPr>
+        <w:t>displaySettings</w:t>
+      </w:r>
+      <w:proofErr w:type="spellEnd"/>
+      <w:r>
+        <w:rPr>
+          <w:sz w:val="20"/>
+          <w:szCs w:val="20"/>
+        </w:rPr>
+        <w:t>(</w:t>
+      </w:r>
+      <w:proofErr w:type="gramEnd"/>
+      <w:r>
+        <w:rPr>
+          <w:sz w:val="20"/>
+          <w:szCs w:val="20"/>
+        </w:rPr>
+        <w:t xml:space="preserve">) </w:t>
+      </w:r>
+      <w:proofErr w:type="spellStart"/>
+      <w:r>
+        <w:rPr>
+          <w:sz w:val="20"/>
+          <w:szCs w:val="20"/>
+        </w:rPr>
+        <w:t>const</w:t>
+      </w:r>
+      <w:proofErr w:type="spellEnd"/>
+    </w:p>
+    <w:p>
+      <w:pPr>
+        <w:spacing w:after="0" w:line="240" w:lineRule="auto"/>
+        <w:ind w:firstLine="360"/>
+        <w:rPr>
+          <w:sz w:val="20"/>
+          <w:szCs w:val="20"/>
+        </w:rPr>
+      </w:pPr>
+      <w:r>
+        <w:rPr>
+          <w:sz w:val="20"/>
+          <w:szCs w:val="20"/>
+        </w:rPr>
+        <w:tab/>
+        <w:t>{</w:t>
+      </w:r>
+    </w:p>
+    <w:p>
+      <w:pPr>
+        <w:spacing w:after="0" w:line="240" w:lineRule="auto"/>
+        <w:ind w:firstLine="360"/>
+        <w:rPr>
+          <w:sz w:val="20"/>
+          <w:szCs w:val="20"/>
+        </w:rPr>
+      </w:pPr>
+      <w:r>
+        <w:rPr>
+          <w:sz w:val="20"/>
+          <w:szCs w:val="20"/>
+        </w:rPr>
+        <w:tab/>
+      </w:r>
+      <w:r>
+        <w:rPr>
+          <w:sz w:val="20"/>
+          <w:szCs w:val="20"/>
+        </w:rPr>
+        <w:tab/>
+      </w:r>
+      <w:proofErr w:type="gramStart"/>
+      <w:r>
+        <w:rPr>
+          <w:sz w:val="20"/>
+          <w:szCs w:val="20"/>
+        </w:rPr>
+        <w:t>std::</w:t>
+      </w:r>
+      <w:proofErr w:type="spellStart"/>
+      <w:proofErr w:type="gramEnd"/>
+      <w:r>
+        <w:rPr>
+          <w:sz w:val="20"/>
+          <w:szCs w:val="20"/>
+        </w:rPr>
+        <w:t>cout</w:t>
+      </w:r>
+      <w:proofErr w:type="spellEnd"/>
+      <w:r>
+        <w:rPr>
+          <w:sz w:val="20"/>
+          <w:szCs w:val="20"/>
+        </w:rPr>
+        <w:t xml:space="preserve"> &lt;&lt; "Brightness: " &lt;&lt; brightness &lt;&lt; ", Width: " &lt;&lt; width &lt;&lt; ", Height: " &lt;&lt; height &lt;&lt; </w:t>
+      </w:r>
+      <w:proofErr w:type="gramStart"/>
+      <w:r>
+        <w:rPr>
+          <w:sz w:val="20"/>
+          <w:szCs w:val="20"/>
+        </w:rPr>
+        <w:t>std::</w:t>
+      </w:r>
+      <w:proofErr w:type="spellStart"/>
+      <w:proofErr w:type="gramEnd"/>
+      <w:r>
+        <w:rPr>
+          <w:sz w:val="20"/>
+          <w:szCs w:val="20"/>
+        </w:rPr>
+        <w:t>endl</w:t>
+      </w:r>
+      <w:proofErr w:type="spellEnd"/>
+      <w:r>
+        <w:rPr>
+          <w:sz w:val="20"/>
+          <w:szCs w:val="20"/>
+        </w:rPr>
+        <w:t>;</w:t>
+      </w:r>
+    </w:p>
+    <w:p>
+      <w:pPr>
+        <w:spacing w:after="0" w:line="240" w:lineRule="auto"/>
+        <w:ind w:firstLine="360"/>
+        <w:rPr>
+          <w:sz w:val="20"/>
+          <w:szCs w:val="20"/>
+        </w:rPr>
+      </w:pPr>
+      <w:r>
+        <w:rPr>
+          <w:sz w:val="20"/>
+          <w:szCs w:val="20"/>
+        </w:rPr>
+        <w:tab/>
+        <w:t>}</w:t>
+      </w:r>
+    </w:p>
+    <w:p>
+      <w:pPr>
+        <w:spacing w:after="0" w:line="240" w:lineRule="auto"/>
+        <w:ind w:firstLine="360"/>
+        <w:rPr>
+          <w:sz w:val="20"/>
+          <w:szCs w:val="20"/>
+        </w:rPr>
+      </w:pPr>
+      <w:r>
+        <w:rPr>
+          <w:sz w:val="20"/>
+          <w:szCs w:val="20"/>
+        </w:rPr>
+        <w:t>};</w:t>
+      </w:r>
+    </w:p>
+    <w:p>
+      <w:pPr>
+        <w:spacing w:after="0" w:line="240" w:lineRule="auto"/>
+        <w:ind w:firstLine="360"/>
+        <w:rPr>
+          <w:b/>
+          <w:bCs/>
+          <w:sz w:val="20"/>
+          <w:szCs w:val="20"/>
+        </w:rPr>
+      </w:pPr>
+      <w:r>
+        <w:rPr>
+          <w:b/>
+          <w:bCs/>
+          <w:sz w:val="20"/>
+          <w:szCs w:val="20"/>
+        </w:rPr>
+        <w:t>Main.cpp</w:t>
+      </w:r>
+    </w:p>
+    <w:p>
+      <w:pPr>
+        <w:spacing w:after="0" w:line="240" w:lineRule="auto"/>
+        <w:ind w:firstLine="360"/>
+        <w:rPr>
+          <w:sz w:val="20"/>
+          <w:szCs w:val="20"/>
+        </w:rPr>
+      </w:pPr>
+      <w:r>
+        <w:rPr>
+          <w:sz w:val="20"/>
+          <w:szCs w:val="20"/>
+        </w:rPr>
+        <w:t>#include &lt;iostream&gt;</w:t>
+      </w:r>
+    </w:p>
+    <w:p>
+      <w:pPr>
+        <w:spacing w:after="0" w:line="240" w:lineRule="auto"/>
+        <w:ind w:firstLine="360"/>
+        <w:rPr>
+          <w:sz w:val="20"/>
+          <w:szCs w:val="20"/>
+        </w:rPr>
+      </w:pPr>
+      <w:r>
+        <w:rPr>
+          <w:sz w:val="20"/>
+          <w:szCs w:val="20"/>
+        </w:rPr>
+        <w:t>#include "</w:t>
+      </w:r>
+      <w:proofErr w:type="spellStart"/>
+      <w:r>
+        <w:rPr>
+          <w:sz w:val="20"/>
+          <w:szCs w:val="20"/>
+        </w:rPr>
+        <w:t>Singleton.h</w:t>
+      </w:r>
+      <w:proofErr w:type="spellEnd"/>
+      <w:r>
+        <w:rPr>
+          <w:sz w:val="20"/>
+          <w:szCs w:val="20"/>
+        </w:rPr>
+        <w:t>"</w:t>
+      </w:r>
+    </w:p>
+    <w:p>
+      <w:pPr>
+        <w:spacing w:after="0" w:line="240" w:lineRule="auto"/>
+        <w:ind w:firstLine="360"/>
+        <w:rPr>
+          <w:sz w:val="20"/>
+          <w:szCs w:val="20"/>
+        </w:rPr>
+      </w:pPr>
+    </w:p>
+    <w:p>
+      <w:pPr>
+        <w:spacing w:after="0" w:line="240" w:lineRule="auto"/>
+        <w:ind w:firstLine="360"/>
+        <w:rPr>
+          <w:sz w:val="20"/>
+          <w:szCs w:val="20"/>
+        </w:rPr>
+      </w:pPr>
+      <w:proofErr w:type="spellStart"/>
+      <w:r>
+        <w:rPr>
+          <w:sz w:val="20"/>
+          <w:szCs w:val="20"/>
+        </w:rPr>
+        <w:t>SingletonGameSetting</w:t>
+      </w:r>
+      <w:proofErr w:type="spellEnd"/>
+      <w:r>
+        <w:rPr>
+          <w:sz w:val="20"/>
+          <w:szCs w:val="20"/>
+        </w:rPr>
+        <w:t xml:space="preserve">* </w:t>
+      </w:r>
+      <w:proofErr w:type="spellStart"/>
+      <w:proofErr w:type="gramStart"/>
+      <w:r>
+        <w:rPr>
+          <w:sz w:val="20"/>
+          <w:szCs w:val="20"/>
+        </w:rPr>
+        <w:t>SingletonGameSetting</w:t>
+      </w:r>
+      <w:proofErr w:type="spellEnd"/>
+      <w:r>
+        <w:rPr>
+          <w:sz w:val="20"/>
+          <w:szCs w:val="20"/>
+        </w:rPr>
+        <w:t>::</w:t>
+      </w:r>
+      <w:proofErr w:type="spellStart"/>
+      <w:proofErr w:type="gramEnd"/>
+      <w:r>
+        <w:rPr>
+          <w:sz w:val="20"/>
+          <w:szCs w:val="20"/>
+        </w:rPr>
+        <w:t>gameSetting</w:t>
+      </w:r>
+      <w:proofErr w:type="spellEnd"/>
+      <w:r>
+        <w:rPr>
+          <w:sz w:val="20"/>
+          <w:szCs w:val="20"/>
+        </w:rPr>
+        <w:t xml:space="preserve"> = </w:t>
+      </w:r>
+      <w:proofErr w:type="spellStart"/>
+      <w:r>
+        <w:rPr>
+          <w:sz w:val="20"/>
+          <w:szCs w:val="20"/>
+        </w:rPr>
+        <w:t>nullptr</w:t>
+      </w:r>
+      <w:proofErr w:type="spellEnd"/>
+      <w:r>
+        <w:rPr>
+          <w:sz w:val="20"/>
+          <w:szCs w:val="20"/>
+        </w:rPr>
+        <w:t>; //3. Static member variable initialization</w:t>
+      </w:r>
+    </w:p>
+    <w:p>
+      <w:pPr>
+        <w:spacing w:after="0" w:line="240" w:lineRule="auto"/>
+        <w:ind w:firstLine="360"/>
+        <w:rPr>
+          <w:sz w:val="20"/>
+          <w:szCs w:val="20"/>
+        </w:rPr>
+      </w:pPr>
+    </w:p>
+    <w:p>
+      <w:pPr>
+        <w:spacing w:after="0" w:line="240" w:lineRule="auto"/>
+        <w:ind w:firstLine="360"/>
+        <w:rPr>
+          <w:sz w:val="20"/>
+          <w:szCs w:val="20"/>
+        </w:rPr>
+      </w:pPr>
+      <w:r>
+        <w:rPr>
+          <w:sz w:val="20"/>
+          <w:szCs w:val="20"/>
+        </w:rPr>
+        <w:t xml:space="preserve">int </w:t>
+      </w:r>
+      <w:proofErr w:type="gramStart"/>
+      <w:r>
+        <w:rPr>
+          <w:sz w:val="20"/>
+          <w:szCs w:val="20"/>
+        </w:rPr>
+        <w:t>main(</w:t>
+      </w:r>
+      <w:proofErr w:type="gramEnd"/>
+      <w:r>
+        <w:rPr>
+          <w:sz w:val="20"/>
+          <w:szCs w:val="20"/>
+        </w:rPr>
+        <w:t>)</w:t>
+      </w:r>
+    </w:p>
+    <w:p>
+      <w:pPr>
+        <w:spacing w:after="0" w:line="240" w:lineRule="auto"/>
+        <w:ind w:firstLine="360"/>
+        <w:rPr>
+          <w:sz w:val="20"/>
+          <w:szCs w:val="20"/>
+        </w:rPr>
+      </w:pPr>
+      <w:r>
+        <w:rPr>
+          <w:sz w:val="20"/>
+          <w:szCs w:val="20"/>
+        </w:rPr>
+        <w:t>{</w:t>
+      </w:r>
+    </w:p>
+    <w:p>
+      <w:pPr>
+        <w:spacing w:after="0" w:line="240" w:lineRule="auto"/>
+        <w:ind w:firstLine="360"/>
+        <w:rPr>
+          <w:sz w:val="20"/>
+          <w:szCs w:val="20"/>
+        </w:rPr>
+      </w:pPr>
+      <w:r>
+        <w:rPr>
+          <w:sz w:val="20"/>
+          <w:szCs w:val="20"/>
+        </w:rPr>
+        <w:t xml:space="preserve">    </w:t>
+      </w:r>
+      <w:proofErr w:type="spellStart"/>
+      <w:r>
+        <w:rPr>
+          <w:sz w:val="20"/>
+          <w:szCs w:val="20"/>
+        </w:rPr>
+        <w:t>SingletonGameSetting</w:t>
+      </w:r>
+      <w:proofErr w:type="spellEnd"/>
+      <w:r>
+        <w:rPr>
+          <w:sz w:val="20"/>
+          <w:szCs w:val="20"/>
+        </w:rPr>
+        <w:t xml:space="preserve">* </w:t>
+      </w:r>
+      <w:proofErr w:type="spellStart"/>
+      <w:r>
+        <w:rPr>
+          <w:sz w:val="20"/>
+          <w:szCs w:val="20"/>
+        </w:rPr>
+        <w:t>GameSetting</w:t>
+      </w:r>
+      <w:proofErr w:type="spellEnd"/>
+      <w:r>
+        <w:rPr>
+          <w:sz w:val="20"/>
+          <w:szCs w:val="20"/>
+        </w:rPr>
+        <w:t xml:space="preserve"> = </w:t>
+      </w:r>
+      <w:proofErr w:type="spellStart"/>
+      <w:proofErr w:type="gramStart"/>
+      <w:r>
+        <w:rPr>
+          <w:sz w:val="20"/>
+          <w:szCs w:val="20"/>
+        </w:rPr>
+        <w:t>SingletonGameSetting</w:t>
+      </w:r>
+      <w:proofErr w:type="spellEnd"/>
+      <w:r>
+        <w:rPr>
+          <w:sz w:val="20"/>
+          <w:szCs w:val="20"/>
+        </w:rPr>
+        <w:t>::</w:t>
+      </w:r>
+      <w:proofErr w:type="spellStart"/>
+      <w:r>
+        <w:rPr>
+          <w:sz w:val="20"/>
+          <w:szCs w:val="20"/>
+        </w:rPr>
+        <w:t>getInstance</w:t>
+      </w:r>
+      <w:proofErr w:type="spellEnd"/>
+      <w:r>
+        <w:rPr>
+          <w:sz w:val="20"/>
+          <w:szCs w:val="20"/>
+        </w:rPr>
+        <w:t>(</w:t>
+      </w:r>
+      <w:proofErr w:type="gramEnd"/>
+      <w:r>
+        <w:rPr>
+          <w:sz w:val="20"/>
+          <w:szCs w:val="20"/>
+        </w:rPr>
+        <w:t>);</w:t>
+      </w:r>
+    </w:p>
+    <w:p>
+      <w:pPr>
+        <w:spacing w:after="0" w:line="240" w:lineRule="auto"/>
+        <w:ind w:firstLine="360"/>
+        <w:rPr>
+          <w:sz w:val="20"/>
+          <w:szCs w:val="20"/>
+        </w:rPr>
+      </w:pPr>
+      <w:r>
+        <w:rPr>
+          <w:sz w:val="20"/>
+          <w:szCs w:val="20"/>
+        </w:rPr>
+        <w:t xml:space="preserve">    </w:t>
+      </w:r>
+      <w:proofErr w:type="spellStart"/>
+      <w:r>
+        <w:rPr>
+          <w:sz w:val="20"/>
+          <w:szCs w:val="20"/>
+        </w:rPr>
+        <w:t>GameSetting</w:t>
+      </w:r>
+      <w:proofErr w:type="spellEnd"/>
+      <w:r>
+        <w:rPr>
+          <w:sz w:val="20"/>
+          <w:szCs w:val="20"/>
+        </w:rPr>
+        <w:t>-&gt;</w:t>
+      </w:r>
+      <w:proofErr w:type="spellStart"/>
+      <w:proofErr w:type="gramStart"/>
+      <w:r>
+        <w:rPr>
+          <w:sz w:val="20"/>
+          <w:szCs w:val="20"/>
+        </w:rPr>
+        <w:t>displaySettings</w:t>
+      </w:r>
+      <w:proofErr w:type="spellEnd"/>
+      <w:r>
+        <w:rPr>
+          <w:sz w:val="20"/>
+          <w:szCs w:val="20"/>
+        </w:rPr>
+        <w:t>(</w:t>
+      </w:r>
+      <w:proofErr w:type="gramEnd"/>
+      <w:r>
+        <w:rPr>
+          <w:sz w:val="20"/>
+          <w:szCs w:val="20"/>
+        </w:rPr>
+        <w:t>);</w:t>
+      </w:r>
+    </w:p>
+    <w:p>
+      <w:pPr>
+        <w:spacing w:after="0" w:line="240" w:lineRule="auto"/>
+        <w:ind w:firstLine="360"/>
+        <w:rPr>
+          <w:sz w:val="20"/>
+          <w:szCs w:val="20"/>
+        </w:rPr>
+      </w:pPr>
+    </w:p>
+    <w:p>
+      <w:pPr>
+        <w:spacing w:after="0" w:line="240" w:lineRule="auto"/>
+        <w:ind w:firstLine="360"/>
+        <w:rPr>
+          <w:sz w:val="20"/>
+          <w:szCs w:val="20"/>
+        </w:rPr>
+      </w:pPr>
+      <w:r>
+        <w:rPr>
+          <w:sz w:val="20"/>
+          <w:szCs w:val="20"/>
+        </w:rPr>
+        <w:t xml:space="preserve">    </w:t>
+      </w:r>
+      <w:proofErr w:type="spellStart"/>
+      <w:r>
+        <w:rPr>
+          <w:sz w:val="20"/>
+          <w:szCs w:val="20"/>
+        </w:rPr>
+        <w:t>SingletonGameSetting</w:t>
+      </w:r>
+      <w:proofErr w:type="spellEnd"/>
+      <w:r>
+        <w:rPr>
+          <w:sz w:val="20"/>
+          <w:szCs w:val="20"/>
+        </w:rPr>
+        <w:t xml:space="preserve">* GameSetting2 = </w:t>
+      </w:r>
+      <w:proofErr w:type="spellStart"/>
+      <w:proofErr w:type="gramStart"/>
+      <w:r>
+        <w:rPr>
+          <w:sz w:val="20"/>
+          <w:szCs w:val="20"/>
+        </w:rPr>
+        <w:t>SingletonGameSetting</w:t>
+      </w:r>
+      <w:proofErr w:type="spellEnd"/>
+      <w:r>
+        <w:rPr>
+          <w:sz w:val="20"/>
+          <w:szCs w:val="20"/>
+        </w:rPr>
+        <w:t>::</w:t>
+      </w:r>
+      <w:proofErr w:type="spellStart"/>
+      <w:r>
+        <w:rPr>
+          <w:sz w:val="20"/>
+          <w:szCs w:val="20"/>
+        </w:rPr>
+        <w:t>getInstance</w:t>
+      </w:r>
+      <w:proofErr w:type="spellEnd"/>
+      <w:r>
+        <w:rPr>
+          <w:sz w:val="20"/>
+          <w:szCs w:val="20"/>
+        </w:rPr>
+        <w:t>(</w:t>
+      </w:r>
+      <w:proofErr w:type="gramEnd"/>
+      <w:r>
+        <w:rPr>
+          <w:sz w:val="20"/>
+          <w:szCs w:val="20"/>
+        </w:rPr>
+        <w:t>);</w:t>
+      </w:r>
+    </w:p>
+    <w:p>
+      <w:pPr>
+        <w:spacing w:after="0" w:line="240" w:lineRule="auto"/>
+        <w:ind w:firstLine="360"/>
+        <w:rPr>
+          <w:sz w:val="20"/>
+          <w:szCs w:val="20"/>
+        </w:rPr>
+      </w:pPr>
+      <w:r>
+        <w:rPr>
+          <w:sz w:val="20"/>
+          <w:szCs w:val="20"/>
+        </w:rPr>
+        <w:t xml:space="preserve">    GameSetting2-&gt;</w:t>
+      </w:r>
+      <w:proofErr w:type="spellStart"/>
+      <w:proofErr w:type="gramStart"/>
+      <w:r>
+        <w:rPr>
+          <w:sz w:val="20"/>
+          <w:szCs w:val="20"/>
+        </w:rPr>
+        <w:t>setBrightness</w:t>
+      </w:r>
+      <w:proofErr w:type="spellEnd"/>
+      <w:r>
+        <w:rPr>
+          <w:sz w:val="20"/>
+          <w:szCs w:val="20"/>
+        </w:rPr>
+        <w:t>(</w:t>
+      </w:r>
+      <w:proofErr w:type="gramEnd"/>
+      <w:r>
+        <w:rPr>
+          <w:sz w:val="20"/>
+          <w:szCs w:val="20"/>
+        </w:rPr>
+        <w:t>100);</w:t>
+      </w:r>
+    </w:p>
+    <w:p>
+      <w:pPr>
+        <w:spacing w:after="0" w:line="240" w:lineRule="auto"/>
+        <w:ind w:firstLine="360"/>
+        <w:rPr>
+          <w:sz w:val="20"/>
+          <w:szCs w:val="20"/>
+        </w:rPr>
+      </w:pPr>
+      <w:r>
+        <w:rPr>
+          <w:sz w:val="20"/>
+          <w:szCs w:val="20"/>
+        </w:rPr>
+        <w:t xml:space="preserve">    GameSetting2-&gt;</w:t>
+      </w:r>
+      <w:proofErr w:type="spellStart"/>
+      <w:proofErr w:type="gramStart"/>
+      <w:r>
+        <w:rPr>
+          <w:sz w:val="20"/>
+          <w:szCs w:val="20"/>
+        </w:rPr>
+        <w:t>displaySettings</w:t>
+      </w:r>
+      <w:proofErr w:type="spellEnd"/>
+      <w:r>
+        <w:rPr>
+          <w:sz w:val="20"/>
+          <w:szCs w:val="20"/>
+        </w:rPr>
+        <w:t>(</w:t>
+      </w:r>
+      <w:proofErr w:type="gramEnd"/>
+      <w:r>
+        <w:rPr>
+          <w:sz w:val="20"/>
+          <w:szCs w:val="20"/>
+        </w:rPr>
+        <w:t>);</w:t>
+      </w:r>
+    </w:p>
+    <w:p>
+      <w:pPr>
+        <w:spacing w:after="0" w:line="240" w:lineRule="auto"/>
+        <w:ind w:firstLine="360"/>
+        <w:rPr>
+          <w:sz w:val="20"/>
+          <w:szCs w:val="20"/>
+        </w:rPr>
+      </w:pPr>
+      <w:r>
+        <w:rPr>
+          <w:sz w:val="20"/>
+          <w:szCs w:val="20"/>
+        </w:rPr>
+        <w:t xml:space="preserve">    //Same object is shared all the places at whole </w:t>
+      </w:r>
+      <w:proofErr w:type="spellStart"/>
+      <w:r>
+        <w:rPr>
+          <w:sz w:val="20"/>
+          <w:szCs w:val="20"/>
+        </w:rPr>
+        <w:t>progran</w:t>
+      </w:r>
+      <w:proofErr w:type="spellEnd"/>
+      <w:r>
+        <w:rPr>
+          <w:sz w:val="20"/>
+          <w:szCs w:val="20"/>
+        </w:rPr>
+        <w:t xml:space="preserve"> because of singleton design pattern.</w:t>
+      </w:r>
+    </w:p>
+    <w:p>
+      <w:pPr>
+        <w:spacing w:after="0" w:line="240" w:lineRule="auto"/>
+        <w:ind w:firstLine="360"/>
+        <w:rPr>
+          <w:sz w:val="20"/>
+          <w:szCs w:val="20"/>
+        </w:rPr>
+      </w:pPr>
+      <w:r>
+        <w:rPr>
+          <w:sz w:val="20"/>
+          <w:szCs w:val="20"/>
+        </w:rPr>
+        <w:t xml:space="preserve">    return 0;</w:t>
+      </w:r>
+    </w:p>
+    <w:p>
+      <w:pPr>
+        <w:spacing w:after="0" w:line="240" w:lineRule="auto"/>
+        <w:ind w:firstLine="360"/>
+        <w:rPr>
+          <w:sz w:val="20"/>
+          <w:szCs w:val="20"/>
+        </w:rPr>
+      </w:pPr>
+      <w:r>
+        <w:rPr>
+          <w:sz w:val="20"/>
+          <w:szCs w:val="20"/>
+        </w:rPr>
+        <w:t>}</w:t>
+      </w:r>
+    </w:p>
+    <w:p>
+      <w:pPr>
+        <w:rPr>
+          <w:sz w:val="20"/>
+          <w:szCs w:val="20"/>
+        </w:rPr>
+      </w:pPr>
+      <w:r>
+        <w:rPr>
+          <w:sz w:val="20"/>
+          <w:szCs w:val="20"/>
+        </w:rPr>
+        <w:br w:type="page"/>
+      </w:r>
+    </w:p>
+    <w:p>
+      <w:pPr>
+        <w:pStyle w:val="ListParagraph"/>
+        <w:numPr>
+          <w:ilvl w:val="0"/>
+          <w:numId w:val="2"/>
+        </w:numPr>
+      </w:pPr>
+      <w:r>
+        <w:lastRenderedPageBreak/>
+        <w:t>Thread safety in singleton design pattern</w:t>
+      </w:r>
+      <w:r>
+        <w:t xml:space="preserve"> (SDP):</w:t>
+      </w:r>
+    </w:p>
+    <w:p>
+      <w:pPr>
+        <w:pStyle w:val="ListParagraph"/>
+        <w:numPr>
+          <w:ilvl w:val="1"/>
+          <w:numId w:val="2"/>
+        </w:numPr>
+      </w:pPr>
+      <w:r>
+        <w:rPr>
+          <w:b/>
+          <w:bCs/>
+        </w:rPr>
+        <w:t>I</w:t>
+      </w:r>
+      <w:r>
+        <w:rPr>
+          <w:b/>
+          <w:bCs/>
+        </w:rPr>
+        <w:t>ssue with singleton pattern</w:t>
+      </w:r>
+      <w:r>
+        <w:t xml:space="preserve"> is that while using in multi-threaded environment, multiple </w:t>
+      </w:r>
+      <w:proofErr w:type="gramStart"/>
+      <w:r>
+        <w:t>instance</w:t>
+      </w:r>
+      <w:proofErr w:type="gramEnd"/>
+      <w:r>
+        <w:t xml:space="preserve"> can be created.</w:t>
+      </w:r>
+    </w:p>
+    <w:p>
+      <w:pPr>
+        <w:pStyle w:val="ListParagraph"/>
+        <w:numPr>
+          <w:ilvl w:val="1"/>
+          <w:numId w:val="2"/>
+        </w:numPr>
+      </w:pPr>
+      <w:r>
+        <w:t xml:space="preserve">//To avoid that locking mechanism can be added in </w:t>
+      </w:r>
+      <w:proofErr w:type="spellStart"/>
+      <w:r>
+        <w:t>getInstance</w:t>
+      </w:r>
+      <w:proofErr w:type="spellEnd"/>
+      <w:r>
+        <w:t xml:space="preserve"> method.</w:t>
+      </w:r>
+    </w:p>
+    <w:p>
+      <w:pPr>
+        <w:pStyle w:val="ListParagraph"/>
+        <w:numPr>
+          <w:ilvl w:val="1"/>
+          <w:numId w:val="2"/>
+        </w:numPr>
+      </w:pPr>
+      <w:r>
+        <w:t>//</w:t>
+      </w:r>
+      <w:proofErr w:type="gramStart"/>
+      <w:r>
+        <w:t>Also</w:t>
+      </w:r>
+      <w:proofErr w:type="gramEnd"/>
+      <w:r>
+        <w:t xml:space="preserve"> memory allocated for singleton instance is never deallocated. To avoid that smart pointer can be used.</w:t>
+      </w:r>
+    </w:p>
+    <w:p>
+      <w:pPr>
+        <w:pStyle w:val="ListParagraph"/>
+        <w:numPr>
+          <w:ilvl w:val="1"/>
+          <w:numId w:val="2"/>
+        </w:numPr>
+      </w:pPr>
+      <w:r>
+        <w:t>//Or a static method can be created to delete the instance when not needed.</w:t>
+      </w:r>
+    </w:p>
+    <w:p>
+      <w:pPr>
+        <w:pStyle w:val="ListParagraph"/>
+        <w:numPr>
+          <w:ilvl w:val="1"/>
+          <w:numId w:val="2"/>
+        </w:numPr>
+      </w:pPr>
+      <w:r>
+        <w:t>//After adding locking mechanism and memory deallocation, singleton pattern can be used in multi-threaded environment safely. But it reduces the performance.</w:t>
+      </w:r>
+    </w:p>
+    <w:p>
+      <w:pPr>
+        <w:ind w:left="1080"/>
+      </w:pPr>
+    </w:p>
+    <w:p>
+      <w:pPr>
+        <w:pStyle w:val="ListParagraph"/>
+        <w:numPr>
+          <w:ilvl w:val="1"/>
+          <w:numId w:val="2"/>
+        </w:numPr>
+      </w:pPr>
+      <w:r>
+        <w:rPr>
+          <w:b/>
+          <w:bCs/>
+        </w:rPr>
+        <w:t>Approach 1:</w:t>
+      </w:r>
+      <w:r>
+        <w:t xml:space="preserve"> Using mutex lock in </w:t>
+      </w:r>
+      <w:proofErr w:type="spellStart"/>
+      <w:r>
+        <w:t>getInstance</w:t>
+      </w:r>
+      <w:proofErr w:type="spellEnd"/>
+      <w:r>
+        <w:t xml:space="preserve"> method. This is not efficient as lock is required only when instance is created first time.</w:t>
+      </w:r>
+    </w:p>
+    <w:p>
+      <w:pPr>
+        <w:pStyle w:val="ListParagraph"/>
+        <w:numPr>
+          <w:ilvl w:val="1"/>
+          <w:numId w:val="2"/>
+        </w:numPr>
+      </w:pPr>
+      <w:r>
+        <w:rPr>
+          <w:b/>
+          <w:bCs/>
+        </w:rPr>
+        <w:t xml:space="preserve">Approach 2: </w:t>
+      </w:r>
+      <w:r>
+        <w:t>eager initialization. Instance is created at the time of static member variable declaration. This is thread-safe but instance is created even if it is not used.</w:t>
+      </w:r>
+    </w:p>
+    <w:p>
+      <w:pPr>
+        <w:pStyle w:val="ListParagraph"/>
+        <w:numPr>
+          <w:ilvl w:val="1"/>
+          <w:numId w:val="2"/>
+        </w:numPr>
+      </w:pPr>
+      <w:r>
+        <w:rPr>
+          <w:b/>
+          <w:bCs/>
+          <w:color w:val="00B050"/>
+        </w:rPr>
+        <w:t>Approach 3:</w:t>
+      </w:r>
+      <w:r>
+        <w:t xml:space="preserve"> Double-checked locking. Lock is required only when instance is created first time. This is efficient and thread-safe.</w:t>
+      </w:r>
+    </w:p>
+    <w:p>
+      <w:pPr>
+        <w:spacing w:after="0" w:line="240" w:lineRule="auto"/>
+        <w:ind w:firstLine="360"/>
+        <w:jc w:val="center"/>
+        <w:rPr>
+          <w:sz w:val="20"/>
+          <w:szCs w:val="20"/>
+        </w:rPr>
+      </w:pPr>
+      <w:r>
+        <w:rPr>
+          <w:sz w:val="20"/>
+          <w:szCs w:val="20"/>
+        </w:rPr>
+        <w:drawing>
+          <wp:inline distT="0" distB="0" distL="0" distR="0" wp14:anchorId="6EC3012F" wp14:editId="4A1165CE">
+            <wp:extent cx="4115374" cy="2248214"/>
+            <wp:effectExtent l="0" t="0" r="0" b="0"/>
+            <wp:docPr id="1207512814" name="Picture 1"/>
+            <wp:cNvGraphicFramePr>
+              <a:graphicFrameLocks xmlns:a="http://schemas.openxmlformats.org/drawingml/2006/main" noChangeAspect="1"/>
+            </wp:cNvGraphicFramePr>
+            <a:graphic xmlns:a="http://schemas.openxmlformats.org/drawingml/2006/main">
+              <a:graphicData uri="http://schemas.openxmlformats.org/drawingml/2006/picture">
+                <pic:pic xmlns:pic="http://schemas.openxmlformats.org/drawingml/2006/picture">
+                  <pic:nvPicPr>
+                    <pic:cNvPr id="1207512814" name=""/>
+                    <pic:cNvPicPr/>
+                  </pic:nvPicPr>
+                  <pic:blipFill>
+                    <a:blip r:embed="rId11"/>
+                    <a:stretch>
+                      <a:fillRect/>
+                    </a:stretch>
+                  </pic:blipFill>
+                  <pic:spPr>
+                    <a:xfrm>
+                      <a:off x="0" y="0"/>
+                      <a:ext cx="4115374" cy="2248214"/>
+                    </a:xfrm>
+                    <a:prstGeom prst="rect">
+                      <a:avLst/>
+                    </a:prstGeom>
+                  </pic:spPr>
+                </pic:pic>
+              </a:graphicData>
+            </a:graphic>
+          </wp:inline>
+        </w:drawing>
+      </w:r>
+    </w:p>
+    <w:p>
+      <w:pPr>
+        <w:spacing w:after="0" w:line="240" w:lineRule="auto"/>
+        <w:ind w:firstLine="360"/>
+        <w:rPr>
+          <w:b/>
+          <w:bCs/>
+          <w:sz w:val="20"/>
+          <w:szCs w:val="20"/>
+        </w:rPr>
+      </w:pPr>
+      <w:r>
+        <w:rPr>
+          <w:b/>
+          <w:bCs/>
+          <w:sz w:val="20"/>
+          <w:szCs w:val="20"/>
+        </w:rPr>
+        <w:t>Code:</w:t>
+      </w:r>
+    </w:p>
+    <w:p>
+      <w:pPr>
+        <w:spacing w:after="0" w:line="240" w:lineRule="auto"/>
+        <w:ind w:firstLine="360"/>
+        <w:rPr>
+          <w:sz w:val="20"/>
+          <w:szCs w:val="20"/>
+        </w:rPr>
+      </w:pPr>
+      <w:r>
+        <w:rPr>
+          <w:sz w:val="20"/>
+          <w:szCs w:val="20"/>
+        </w:rPr>
+        <w:t>public:</w:t>
+      </w:r>
+    </w:p>
+    <w:p>
+      <w:pPr>
+        <w:spacing w:after="0" w:line="240" w:lineRule="auto"/>
+        <w:ind w:firstLine="360"/>
+        <w:rPr>
+          <w:sz w:val="20"/>
+          <w:szCs w:val="20"/>
+        </w:rPr>
+      </w:pPr>
+      <w:r>
+        <w:rPr>
+          <w:sz w:val="20"/>
+          <w:szCs w:val="20"/>
+        </w:rPr>
+        <w:t xml:space="preserve">    static </w:t>
+      </w:r>
+      <w:proofErr w:type="spellStart"/>
+      <w:r>
+        <w:rPr>
+          <w:sz w:val="20"/>
+          <w:szCs w:val="20"/>
+        </w:rPr>
+        <w:t>SingletonGameSetting</w:t>
+      </w:r>
+      <w:proofErr w:type="spellEnd"/>
+      <w:r>
+        <w:rPr>
+          <w:sz w:val="20"/>
+          <w:szCs w:val="20"/>
+        </w:rPr>
+        <w:t xml:space="preserve">* </w:t>
+      </w:r>
+      <w:proofErr w:type="spellStart"/>
+      <w:proofErr w:type="gramStart"/>
+      <w:r>
+        <w:rPr>
+          <w:sz w:val="20"/>
+          <w:szCs w:val="20"/>
+        </w:rPr>
+        <w:t>getInstance</w:t>
+      </w:r>
+      <w:proofErr w:type="spellEnd"/>
+      <w:r>
+        <w:rPr>
+          <w:sz w:val="20"/>
+          <w:szCs w:val="20"/>
+        </w:rPr>
+        <w:t>(</w:t>
+      </w:r>
+      <w:proofErr w:type="gramEnd"/>
+      <w:r>
+        <w:rPr>
+          <w:sz w:val="20"/>
+          <w:szCs w:val="20"/>
+        </w:rPr>
+        <w:t>)</w:t>
+      </w:r>
+    </w:p>
+    <w:p>
+      <w:pPr>
+        <w:spacing w:after="0" w:line="240" w:lineRule="auto"/>
+        <w:ind w:firstLine="360"/>
+        <w:rPr>
+          <w:sz w:val="20"/>
+          <w:szCs w:val="20"/>
+        </w:rPr>
+      </w:pPr>
+      <w:r>
+        <w:rPr>
+          <w:sz w:val="20"/>
+          <w:szCs w:val="20"/>
+        </w:rPr>
+        <w:t xml:space="preserve">    {</w:t>
+      </w:r>
+    </w:p>
+    <w:p>
+      <w:pPr>
+        <w:spacing w:after="0" w:line="240" w:lineRule="auto"/>
+        <w:ind w:firstLine="360"/>
+        <w:rPr>
+          <w:sz w:val="20"/>
+          <w:szCs w:val="20"/>
+        </w:rPr>
+      </w:pPr>
+      <w:r>
+        <w:rPr>
+          <w:sz w:val="20"/>
+          <w:szCs w:val="20"/>
+        </w:rPr>
+        <w:t xml:space="preserve">        if (</w:t>
+      </w:r>
+      <w:proofErr w:type="spellStart"/>
+      <w:r>
+        <w:rPr>
+          <w:sz w:val="20"/>
+          <w:szCs w:val="20"/>
+        </w:rPr>
+        <w:t>gameSetting</w:t>
+      </w:r>
+      <w:proofErr w:type="spellEnd"/>
+      <w:r>
+        <w:rPr>
+          <w:sz w:val="20"/>
+          <w:szCs w:val="20"/>
+        </w:rPr>
+        <w:t xml:space="preserve"> == </w:t>
+      </w:r>
+      <w:proofErr w:type="spellStart"/>
+      <w:proofErr w:type="gramStart"/>
+      <w:r>
+        <w:rPr>
+          <w:sz w:val="20"/>
+          <w:szCs w:val="20"/>
+        </w:rPr>
+        <w:t>nullptr</w:t>
+      </w:r>
+      <w:proofErr w:type="spellEnd"/>
+      <w:r>
+        <w:rPr>
+          <w:sz w:val="20"/>
+          <w:szCs w:val="20"/>
+        </w:rPr>
+        <w:t xml:space="preserve">)   </w:t>
+      </w:r>
+      <w:proofErr w:type="gramEnd"/>
+      <w:r>
+        <w:rPr>
+          <w:sz w:val="20"/>
+          <w:szCs w:val="20"/>
+        </w:rPr>
+        <w:t>// first check (no lock)</w:t>
+      </w:r>
+    </w:p>
+    <w:p>
+      <w:pPr>
+        <w:spacing w:after="0" w:line="240" w:lineRule="auto"/>
+        <w:ind w:firstLine="360"/>
+        <w:rPr>
+          <w:sz w:val="20"/>
+          <w:szCs w:val="20"/>
+        </w:rPr>
+      </w:pPr>
+      <w:r>
+        <w:rPr>
+          <w:sz w:val="20"/>
+          <w:szCs w:val="20"/>
+        </w:rPr>
+        <w:t xml:space="preserve">        {</w:t>
+      </w:r>
+    </w:p>
+    <w:p>
+      <w:pPr>
+        <w:spacing w:after="0" w:line="240" w:lineRule="auto"/>
+        <w:ind w:firstLine="360"/>
+        <w:rPr>
+          <w:b/>
+          <w:bCs/>
+          <w:sz w:val="20"/>
+          <w:szCs w:val="20"/>
+        </w:rPr>
+      </w:pPr>
+      <w:r>
+        <w:rPr>
+          <w:sz w:val="20"/>
+          <w:szCs w:val="20"/>
+        </w:rPr>
+        <w:t xml:space="preserve">            </w:t>
+      </w:r>
+      <w:proofErr w:type="gramStart"/>
+      <w:r>
+        <w:rPr>
+          <w:b/>
+          <w:bCs/>
+          <w:sz w:val="20"/>
+          <w:szCs w:val="20"/>
+        </w:rPr>
+        <w:t>std::</w:t>
+      </w:r>
+      <w:proofErr w:type="spellStart"/>
+      <w:proofErr w:type="gramEnd"/>
+      <w:r>
+        <w:rPr>
+          <w:b/>
+          <w:bCs/>
+          <w:sz w:val="20"/>
+          <w:szCs w:val="20"/>
+        </w:rPr>
+        <w:t>lock_guard</w:t>
+      </w:r>
+      <w:proofErr w:type="spellEnd"/>
+      <w:r>
+        <w:rPr>
+          <w:b/>
+          <w:bCs/>
+          <w:sz w:val="20"/>
+          <w:szCs w:val="20"/>
+        </w:rPr>
+        <w:t>&lt;</w:t>
+      </w:r>
+      <w:proofErr w:type="gramStart"/>
+      <w:r>
+        <w:rPr>
+          <w:b/>
+          <w:bCs/>
+          <w:sz w:val="20"/>
+          <w:szCs w:val="20"/>
+        </w:rPr>
+        <w:t>std::</w:t>
+      </w:r>
+      <w:proofErr w:type="gramEnd"/>
+      <w:r>
+        <w:rPr>
+          <w:b/>
+          <w:bCs/>
+          <w:sz w:val="20"/>
+          <w:szCs w:val="20"/>
+        </w:rPr>
+        <w:t>mutex&gt; lock(</w:t>
+      </w:r>
+      <w:proofErr w:type="spellStart"/>
+      <w:r>
+        <w:rPr>
+          <w:b/>
+          <w:bCs/>
+          <w:sz w:val="20"/>
+          <w:szCs w:val="20"/>
+        </w:rPr>
+        <w:t>mtx</w:t>
+      </w:r>
+      <w:proofErr w:type="spellEnd"/>
+      <w:r>
+        <w:rPr>
+          <w:b/>
+          <w:bCs/>
+          <w:sz w:val="20"/>
+          <w:szCs w:val="20"/>
+        </w:rPr>
+        <w:t>); // lock mutex</w:t>
+      </w:r>
+    </w:p>
+    <w:p>
+      <w:pPr>
+        <w:spacing w:after="0" w:line="240" w:lineRule="auto"/>
+        <w:ind w:firstLine="360"/>
+        <w:rPr>
+          <w:sz w:val="20"/>
+          <w:szCs w:val="20"/>
+        </w:rPr>
+      </w:pPr>
+      <w:r>
+        <w:rPr>
+          <w:sz w:val="20"/>
+          <w:szCs w:val="20"/>
+        </w:rPr>
+        <w:t xml:space="preserve">            if (</w:t>
+      </w:r>
+      <w:proofErr w:type="spellStart"/>
+      <w:r>
+        <w:rPr>
+          <w:sz w:val="20"/>
+          <w:szCs w:val="20"/>
+        </w:rPr>
+        <w:t>gameSetting</w:t>
+      </w:r>
+      <w:proofErr w:type="spellEnd"/>
+      <w:r>
+        <w:rPr>
+          <w:sz w:val="20"/>
+          <w:szCs w:val="20"/>
+        </w:rPr>
+        <w:t xml:space="preserve"> == </w:t>
+      </w:r>
+      <w:proofErr w:type="spellStart"/>
+      <w:r>
+        <w:rPr>
+          <w:sz w:val="20"/>
+          <w:szCs w:val="20"/>
+        </w:rPr>
+        <w:t>nullptr</w:t>
+      </w:r>
+      <w:proofErr w:type="spellEnd"/>
+      <w:r>
+        <w:rPr>
+          <w:sz w:val="20"/>
+          <w:szCs w:val="20"/>
+        </w:rPr>
+        <w:t>) // second check (with lock)</w:t>
+      </w:r>
+    </w:p>
+    <w:p>
+      <w:pPr>
+        <w:spacing w:after="0" w:line="240" w:lineRule="auto"/>
+        <w:ind w:firstLine="360"/>
+        <w:rPr>
+          <w:sz w:val="20"/>
+          <w:szCs w:val="20"/>
+        </w:rPr>
+      </w:pPr>
+      <w:r>
+        <w:rPr>
+          <w:sz w:val="20"/>
+          <w:szCs w:val="20"/>
+        </w:rPr>
+        <w:t xml:space="preserve">            {</w:t>
+      </w:r>
+    </w:p>
+    <w:p>
+      <w:pPr>
+        <w:spacing w:after="0" w:line="240" w:lineRule="auto"/>
+        <w:ind w:firstLine="360"/>
+        <w:rPr>
+          <w:sz w:val="20"/>
+          <w:szCs w:val="20"/>
+        </w:rPr>
+      </w:pPr>
+      <w:r>
+        <w:rPr>
+          <w:sz w:val="20"/>
+          <w:szCs w:val="20"/>
+        </w:rPr>
+        <w:t xml:space="preserve">                </w:t>
+      </w:r>
+      <w:proofErr w:type="spellStart"/>
+      <w:r>
+        <w:rPr>
+          <w:sz w:val="20"/>
+          <w:szCs w:val="20"/>
+        </w:rPr>
+        <w:t>gameSetting</w:t>
+      </w:r>
+      <w:proofErr w:type="spellEnd"/>
+      <w:r>
+        <w:rPr>
+          <w:sz w:val="20"/>
+          <w:szCs w:val="20"/>
+        </w:rPr>
+        <w:t xml:space="preserve"> = new </w:t>
+      </w:r>
+      <w:proofErr w:type="spellStart"/>
+      <w:proofErr w:type="gramStart"/>
+      <w:r>
+        <w:rPr>
+          <w:sz w:val="20"/>
+          <w:szCs w:val="20"/>
+        </w:rPr>
+        <w:t>SingletonGameSetting</w:t>
+      </w:r>
+      <w:proofErr w:type="spellEnd"/>
+      <w:r>
+        <w:rPr>
+          <w:sz w:val="20"/>
+          <w:szCs w:val="20"/>
+        </w:rPr>
+        <w:t>(</w:t>
+      </w:r>
+      <w:proofErr w:type="gramEnd"/>
+      <w:r>
+        <w:rPr>
+          <w:sz w:val="20"/>
+          <w:szCs w:val="20"/>
+        </w:rPr>
+        <w:t>);</w:t>
+      </w:r>
+    </w:p>
+    <w:p>
+      <w:pPr>
+        <w:spacing w:after="0" w:line="240" w:lineRule="auto"/>
+        <w:ind w:firstLine="360"/>
+        <w:rPr>
+          <w:sz w:val="20"/>
+          <w:szCs w:val="20"/>
+        </w:rPr>
+      </w:pPr>
+      <w:r>
+        <w:rPr>
+          <w:sz w:val="20"/>
+          <w:szCs w:val="20"/>
+        </w:rPr>
+        <w:t xml:space="preserve">            }</w:t>
+      </w:r>
+    </w:p>
+    <w:p>
+      <w:pPr>
+        <w:spacing w:after="0" w:line="240" w:lineRule="auto"/>
+        <w:ind w:firstLine="360"/>
+        <w:rPr>
+          <w:sz w:val="20"/>
+          <w:szCs w:val="20"/>
+        </w:rPr>
+      </w:pPr>
+      <w:r>
+        <w:rPr>
+          <w:sz w:val="20"/>
+          <w:szCs w:val="20"/>
+        </w:rPr>
+        <w:t xml:space="preserve">        }</w:t>
+      </w:r>
+    </w:p>
+    <w:p>
+      <w:pPr>
+        <w:spacing w:after="0" w:line="240" w:lineRule="auto"/>
+        <w:ind w:firstLine="360"/>
+        <w:rPr>
+          <w:sz w:val="20"/>
+          <w:szCs w:val="20"/>
+        </w:rPr>
+      </w:pPr>
+      <w:r>
+        <w:rPr>
+          <w:sz w:val="20"/>
+          <w:szCs w:val="20"/>
+        </w:rPr>
+        <w:t xml:space="preserve">        return </w:t>
+      </w:r>
+      <w:proofErr w:type="spellStart"/>
+      <w:r>
+        <w:rPr>
+          <w:sz w:val="20"/>
+          <w:szCs w:val="20"/>
+        </w:rPr>
+        <w:t>gameSetting</w:t>
+      </w:r>
+      <w:proofErr w:type="spellEnd"/>
+      <w:r>
+        <w:rPr>
+          <w:sz w:val="20"/>
+          <w:szCs w:val="20"/>
+        </w:rPr>
+        <w:t>;</w:t>
+      </w:r>
+    </w:p>
+    <w:p>
+      <w:pPr>
+        <w:spacing w:after="0" w:line="240" w:lineRule="auto"/>
+        <w:ind w:firstLine="360"/>
+        <w:rPr>
+          <w:sz w:val="20"/>
+          <w:szCs w:val="20"/>
+        </w:rPr>
+      </w:pPr>
+      <w:r>
+        <w:rPr>
+          <w:sz w:val="20"/>
+          <w:szCs w:val="20"/>
+        </w:rPr>
+        <w:t xml:space="preserve">    }</w:t>
+      </w:r>
+    </w:p>
+    <w:p>
+      <w:pPr>
+        <w:spacing w:after="0" w:line="240" w:lineRule="auto"/>
+        <w:ind w:firstLine="360"/>
+        <w:rPr>
+          <w:sz w:val="20"/>
+          <w:szCs w:val="20"/>
+        </w:rPr>
+      </w:pPr>
+    </w:p>
+    <w:p>
+      <w:pPr>
+        <w:spacing w:after="0" w:line="240" w:lineRule="auto"/>
+        <w:ind w:firstLine="360"/>
+        <w:rPr>
+          <w:b/>
+          <w:bCs/>
+          <w:sz w:val="20"/>
+          <w:szCs w:val="20"/>
+        </w:rPr>
+      </w:pPr>
+      <w:r>
+        <w:rPr>
+          <w:b/>
+          <w:bCs/>
+          <w:sz w:val="20"/>
+          <w:szCs w:val="20"/>
+        </w:rPr>
+        <w:t>Key Notes</w:t>
+      </w:r>
+    </w:p>
+    <w:p>
+      <w:pPr>
+        <w:numPr>
+          <w:ilvl w:val="0"/>
+          <w:numId w:val="7"/>
+        </w:numPr>
+        <w:spacing w:after="0" w:line="240" w:lineRule="auto"/>
+        <w:rPr>
+          <w:sz w:val="20"/>
+          <w:szCs w:val="20"/>
+        </w:rPr>
+      </w:pPr>
+      <w:proofErr w:type="gramStart"/>
+      <w:r>
+        <w:rPr>
+          <w:sz w:val="20"/>
+          <w:szCs w:val="20"/>
+        </w:rPr>
+        <w:t>std::</w:t>
+      </w:r>
+      <w:proofErr w:type="gramEnd"/>
+      <w:r>
+        <w:rPr>
+          <w:sz w:val="20"/>
+          <w:szCs w:val="20"/>
+        </w:rPr>
+        <w:t xml:space="preserve">mutex </w:t>
+      </w:r>
+      <w:proofErr w:type="spellStart"/>
+      <w:r>
+        <w:rPr>
+          <w:sz w:val="20"/>
+          <w:szCs w:val="20"/>
+        </w:rPr>
+        <w:t>mtx</w:t>
+      </w:r>
+      <w:proofErr w:type="spellEnd"/>
+      <w:r>
+        <w:rPr>
+          <w:sz w:val="20"/>
+          <w:szCs w:val="20"/>
+        </w:rPr>
+        <w:t>; is defined as a static member, so all threads share the same lock.</w:t>
+      </w:r>
+    </w:p>
+    <w:p>
+      <w:pPr>
+        <w:numPr>
+          <w:ilvl w:val="0"/>
+          <w:numId w:val="7"/>
+        </w:numPr>
+        <w:spacing w:after="0" w:line="240" w:lineRule="auto"/>
+        <w:rPr>
+          <w:sz w:val="20"/>
+          <w:szCs w:val="20"/>
+        </w:rPr>
+      </w:pPr>
+      <w:proofErr w:type="gramStart"/>
+      <w:r>
+        <w:rPr>
+          <w:sz w:val="20"/>
+          <w:szCs w:val="20"/>
+        </w:rPr>
+        <w:t>std::</w:t>
+      </w:r>
+      <w:proofErr w:type="spellStart"/>
+      <w:proofErr w:type="gramEnd"/>
+      <w:r>
+        <w:rPr>
+          <w:sz w:val="20"/>
+          <w:szCs w:val="20"/>
+        </w:rPr>
+        <w:t>lock_guard</w:t>
+      </w:r>
+      <w:proofErr w:type="spellEnd"/>
+      <w:r>
+        <w:rPr>
+          <w:sz w:val="20"/>
+          <w:szCs w:val="20"/>
+        </w:rPr>
+        <w:t>&lt;</w:t>
+      </w:r>
+      <w:proofErr w:type="gramStart"/>
+      <w:r>
+        <w:rPr>
+          <w:sz w:val="20"/>
+          <w:szCs w:val="20"/>
+        </w:rPr>
+        <w:t>std::</w:t>
+      </w:r>
+      <w:proofErr w:type="gramEnd"/>
+      <w:r>
+        <w:rPr>
+          <w:sz w:val="20"/>
+          <w:szCs w:val="20"/>
+        </w:rPr>
+        <w:t xml:space="preserve">mutex&gt; automatically </w:t>
+      </w:r>
+      <w:r>
+        <w:rPr>
+          <w:b/>
+          <w:bCs/>
+          <w:sz w:val="20"/>
+          <w:szCs w:val="20"/>
+        </w:rPr>
+        <w:t>locks</w:t>
+      </w:r>
+      <w:r>
+        <w:rPr>
+          <w:sz w:val="20"/>
+          <w:szCs w:val="20"/>
+        </w:rPr>
+        <w:t xml:space="preserve"> in constructor and </w:t>
+      </w:r>
+      <w:r>
+        <w:rPr>
+          <w:b/>
+          <w:bCs/>
+          <w:sz w:val="20"/>
+          <w:szCs w:val="20"/>
+        </w:rPr>
+        <w:t>unlocks</w:t>
+      </w:r>
+      <w:r>
+        <w:rPr>
+          <w:sz w:val="20"/>
+          <w:szCs w:val="20"/>
+        </w:rPr>
+        <w:t xml:space="preserve"> when going out of scope (no need for manual </w:t>
+      </w:r>
+      <w:proofErr w:type="gramStart"/>
+      <w:r>
+        <w:rPr>
+          <w:sz w:val="20"/>
+          <w:szCs w:val="20"/>
+        </w:rPr>
+        <w:t>unlock</w:t>
+      </w:r>
+      <w:proofErr w:type="gramEnd"/>
+      <w:r>
+        <w:rPr>
+          <w:sz w:val="20"/>
+          <w:szCs w:val="20"/>
+        </w:rPr>
+        <w:t>).</w:t>
+      </w:r>
+    </w:p>
+    <w:p>
+      <w:pPr>
+        <w:numPr>
+          <w:ilvl w:val="0"/>
+          <w:numId w:val="7"/>
+        </w:numPr>
+        <w:spacing w:after="0" w:line="240" w:lineRule="auto"/>
+        <w:rPr>
+          <w:sz w:val="20"/>
+          <w:szCs w:val="20"/>
+        </w:rPr>
+      </w:pPr>
+      <w:r>
+        <w:rPr>
+          <w:sz w:val="20"/>
+          <w:szCs w:val="20"/>
+        </w:rPr>
+        <w:t xml:space="preserve">The </w:t>
+      </w:r>
+      <w:r>
+        <w:rPr>
+          <w:b/>
+          <w:bCs/>
+          <w:sz w:val="20"/>
+          <w:szCs w:val="20"/>
+        </w:rPr>
+        <w:t>double-checked locking</w:t>
+      </w:r>
+      <w:r>
+        <w:rPr>
+          <w:sz w:val="20"/>
+          <w:szCs w:val="20"/>
+        </w:rPr>
+        <w:t xml:space="preserve"> pattern ensures performance:</w:t>
+      </w:r>
+    </w:p>
+    <w:p>
+      <w:pPr>
+        <w:numPr>
+          <w:ilvl w:val="1"/>
+          <w:numId w:val="7"/>
+        </w:numPr>
+        <w:spacing w:after="0" w:line="240" w:lineRule="auto"/>
+        <w:rPr>
+          <w:sz w:val="20"/>
+          <w:szCs w:val="20"/>
+        </w:rPr>
+      </w:pPr>
+      <w:r>
+        <w:rPr>
+          <w:sz w:val="20"/>
+          <w:szCs w:val="20"/>
+        </w:rPr>
+        <w:t>First check avoids unnecessary locking.</w:t>
+      </w:r>
+    </w:p>
+    <w:p>
+      <w:pPr>
+        <w:numPr>
+          <w:ilvl w:val="1"/>
+          <w:numId w:val="7"/>
+        </w:numPr>
+        <w:spacing w:after="0" w:line="240" w:lineRule="auto"/>
+        <w:rPr>
+          <w:sz w:val="20"/>
+          <w:szCs w:val="20"/>
+        </w:rPr>
+      </w:pPr>
+      <w:r>
+        <w:rPr>
+          <w:sz w:val="20"/>
+          <w:szCs w:val="20"/>
+        </w:rPr>
+        <w:t>Second check guarantees correctness when multiple threads race.</w:t>
+      </w:r>
+    </w:p>
+    <w:p>
+      <w:pPr>
+        <w:spacing w:after="0" w:line="240" w:lineRule="auto"/>
+        <w:ind w:firstLine="360"/>
+        <w:rPr>
+          <w:sz w:val="20"/>
+          <w:szCs w:val="20"/>
+        </w:rPr>
+      </w:pPr>
+      <w:r>
+        <w:rPr>
+          <w:rFonts w:ascii="Segoe UI Emoji" w:hAnsi="Segoe UI Emoji" w:cs="Segoe UI Emoji"/>
+          <w:sz w:val="20"/>
+          <w:szCs w:val="20"/>
+        </w:rPr>
+        <w:t>👉</w:t>
+      </w:r>
+      <w:r>
+        <w:rPr>
+          <w:sz w:val="20"/>
+          <w:szCs w:val="20"/>
+        </w:rPr>
+        <w:t xml:space="preserve"> If you’re on C++11+, a </w:t>
+      </w:r>
+      <w:r>
+        <w:rPr>
+          <w:b/>
+          <w:bCs/>
+          <w:sz w:val="20"/>
+          <w:szCs w:val="20"/>
+        </w:rPr>
+        <w:t>much simpler and thread-safe</w:t>
+      </w:r>
+      <w:r>
+        <w:rPr>
+          <w:sz w:val="20"/>
+          <w:szCs w:val="20"/>
+        </w:rPr>
+        <w:t xml:space="preserve"> way is using a local static variable inside </w:t>
+      </w:r>
+      <w:proofErr w:type="spellStart"/>
+      <w:proofErr w:type="gramStart"/>
+      <w:r>
+        <w:rPr>
+          <w:sz w:val="20"/>
+          <w:szCs w:val="20"/>
+        </w:rPr>
+        <w:t>getInstance</w:t>
+      </w:r>
+      <w:proofErr w:type="spellEnd"/>
+      <w:r>
+        <w:rPr>
+          <w:sz w:val="20"/>
+          <w:szCs w:val="20"/>
+        </w:rPr>
+        <w:t>(</w:t>
+      </w:r>
+      <w:proofErr w:type="gramEnd"/>
+      <w:r>
+        <w:rPr>
+          <w:sz w:val="20"/>
+          <w:szCs w:val="20"/>
+        </w:rPr>
+        <w:t>):</w:t>
+      </w:r>
+    </w:p>
+    <w:p>
+      <w:pPr>
+        <w:spacing w:after="0" w:line="240" w:lineRule="auto"/>
+        <w:ind w:firstLine="360"/>
+        <w:rPr>
+          <w:sz w:val="20"/>
+          <w:szCs w:val="20"/>
+        </w:rPr>
+      </w:pPr>
+    </w:p>
+    <w:p>
+      <w:pPr>
+        <w:spacing w:after="0" w:line="240" w:lineRule="auto"/>
+        <w:ind w:firstLine="360"/>
+        <w:rPr>
+          <w:b/>
+          <w:bCs/>
+          <w:sz w:val="20"/>
+          <w:szCs w:val="20"/>
+        </w:rPr>
+      </w:pPr>
+      <w:r>
+        <w:rPr>
+          <w:b/>
+          <w:bCs/>
+          <w:sz w:val="20"/>
+          <w:szCs w:val="20"/>
+        </w:rPr>
+        <w:lastRenderedPageBreak/>
+        <w:t>Code:</w:t>
+      </w:r>
+    </w:p>
+    <w:p>
+      <w:pPr>
+        <w:spacing w:after="0" w:line="240" w:lineRule="auto"/>
+        <w:ind w:firstLine="360"/>
+        <w:rPr>
+          <w:sz w:val="20"/>
+          <w:szCs w:val="20"/>
+        </w:rPr>
+      </w:pPr>
+      <w:r>
+        <w:rPr>
+          <w:sz w:val="20"/>
+          <w:szCs w:val="20"/>
+        </w:rPr>
+        <w:t>public:</w:t>
+      </w:r>
+    </w:p>
+    <w:p>
+      <w:pPr>
+        <w:spacing w:after="0" w:line="240" w:lineRule="auto"/>
+        <w:ind w:firstLine="360"/>
+        <w:rPr>
+          <w:sz w:val="20"/>
+          <w:szCs w:val="20"/>
+        </w:rPr>
+      </w:pPr>
+      <w:r>
+        <w:rPr>
+          <w:sz w:val="20"/>
+          <w:szCs w:val="20"/>
+        </w:rPr>
+        <w:t xml:space="preserve">    // Meyers' Singleton: thread-safe in C++11 and later</w:t>
+      </w:r>
+    </w:p>
+    <w:p>
+      <w:pPr>
+        <w:spacing w:after="0" w:line="240" w:lineRule="auto"/>
+        <w:ind w:firstLine="360"/>
+        <w:rPr>
+          <w:sz w:val="20"/>
+          <w:szCs w:val="20"/>
+        </w:rPr>
+      </w:pPr>
+      <w:r>
+        <w:rPr>
+          <w:sz w:val="20"/>
+          <w:szCs w:val="20"/>
+        </w:rPr>
+        <w:t xml:space="preserve">    static </w:t>
+      </w:r>
+      <w:proofErr w:type="spellStart"/>
+      <w:r>
+        <w:rPr>
+          <w:sz w:val="20"/>
+          <w:szCs w:val="20"/>
+        </w:rPr>
+        <w:t>SingletonGameSetting</w:t>
+      </w:r>
+      <w:proofErr w:type="spellEnd"/>
+      <w:r>
+        <w:rPr>
+          <w:sz w:val="20"/>
+          <w:szCs w:val="20"/>
+        </w:rPr>
+        <w:t xml:space="preserve">&amp; </w:t>
+      </w:r>
+      <w:proofErr w:type="spellStart"/>
+      <w:proofErr w:type="gramStart"/>
+      <w:r>
+        <w:rPr>
+          <w:sz w:val="20"/>
+          <w:szCs w:val="20"/>
+        </w:rPr>
+        <w:t>getInstance</w:t>
+      </w:r>
+      <w:proofErr w:type="spellEnd"/>
+      <w:r>
+        <w:rPr>
+          <w:sz w:val="20"/>
+          <w:szCs w:val="20"/>
+        </w:rPr>
+        <w:t>(</w:t>
+      </w:r>
+      <w:proofErr w:type="gramEnd"/>
+      <w:r>
+        <w:rPr>
+          <w:sz w:val="20"/>
+          <w:szCs w:val="20"/>
+        </w:rPr>
+        <w:t>)</w:t>
+      </w:r>
+    </w:p>
+    <w:p>
+      <w:pPr>
+        <w:spacing w:after="0" w:line="240" w:lineRule="auto"/>
+        <w:ind w:firstLine="360"/>
+        <w:rPr>
+          <w:sz w:val="20"/>
+          <w:szCs w:val="20"/>
+        </w:rPr>
+      </w:pPr>
+      <w:r>
+        <w:rPr>
+          <w:sz w:val="20"/>
+          <w:szCs w:val="20"/>
+        </w:rPr>
+        <w:t xml:space="preserve">    {</w:t>
+      </w:r>
+    </w:p>
+    <w:p>
+      <w:pPr>
+        <w:spacing w:after="0" w:line="240" w:lineRule="auto"/>
+        <w:ind w:firstLine="360"/>
+        <w:rPr>
+          <w:sz w:val="20"/>
+          <w:szCs w:val="20"/>
+        </w:rPr>
+      </w:pPr>
+      <w:r>
+        <w:rPr>
+          <w:sz w:val="20"/>
+          <w:szCs w:val="20"/>
+        </w:rPr>
+        <w:t xml:space="preserve">        static </w:t>
+      </w:r>
+      <w:proofErr w:type="spellStart"/>
+      <w:r>
+        <w:rPr>
+          <w:sz w:val="20"/>
+          <w:szCs w:val="20"/>
+        </w:rPr>
+        <w:t>SingletonGameSetting</w:t>
+      </w:r>
+      <w:proofErr w:type="spellEnd"/>
+      <w:r>
+        <w:rPr>
+          <w:sz w:val="20"/>
+          <w:szCs w:val="20"/>
+        </w:rPr>
+        <w:t xml:space="preserve"> instance; // created only once, guaranteed thread-safe</w:t>
+      </w:r>
+    </w:p>
+    <w:p>
+      <w:pPr>
+        <w:spacing w:after="0" w:line="240" w:lineRule="auto"/>
+        <w:ind w:firstLine="360"/>
+        <w:rPr>
+          <w:sz w:val="20"/>
+          <w:szCs w:val="20"/>
+        </w:rPr>
+      </w:pPr>
+      <w:r>
+        <w:rPr>
+          <w:sz w:val="20"/>
+          <w:szCs w:val="20"/>
+        </w:rPr>
+        <w:t xml:space="preserve">        return instance;</w:t>
+      </w:r>
+    </w:p>
+    <w:p>
+      <w:pPr>
+        <w:spacing w:after="0" w:line="240" w:lineRule="auto"/>
+        <w:ind w:firstLine="360"/>
+        <w:rPr>
+          <w:sz w:val="20"/>
+          <w:szCs w:val="20"/>
+        </w:rPr>
+      </w:pPr>
+      <w:r>
+        <w:rPr>
+          <w:sz w:val="20"/>
+          <w:szCs w:val="20"/>
+        </w:rPr>
+        <w:t xml:space="preserve">    }</w:t>
+      </w:r>
+    </w:p>
+    <w:p>
+      <w:pPr>
+        <w:spacing w:after="0" w:line="240" w:lineRule="auto"/>
+        <w:ind w:firstLine="360"/>
+        <w:rPr>
+          <w:sz w:val="20"/>
+          <w:szCs w:val="20"/>
+        </w:rPr>
+      </w:pPr>
+    </w:p>
+    <w:p>
+      <w:pPr>
+        <w:spacing w:after="0" w:line="240" w:lineRule="auto"/>
+        <w:ind w:firstLine="360"/>
+        <w:rPr>
+          <w:sz w:val="20"/>
+          <w:szCs w:val="20"/>
+        </w:rPr>
+      </w:pPr>
+      <w:r>
+        <w:rPr>
+          <w:sz w:val="20"/>
+          <w:szCs w:val="20"/>
+        </w:rPr>
+        <w:t xml:space="preserve">    // Delete copy/move operations to enforce single instance</w:t>
+      </w:r>
+    </w:p>
+    <w:p>
+      <w:pPr>
+        <w:spacing w:after="0" w:line="240" w:lineRule="auto"/>
+        <w:ind w:firstLine="360"/>
+        <w:rPr>
+          <w:sz w:val="20"/>
+          <w:szCs w:val="20"/>
+        </w:rPr>
+      </w:pPr>
+      <w:r>
+        <w:rPr>
+          <w:sz w:val="20"/>
+          <w:szCs w:val="20"/>
+        </w:rPr>
+        <w:t xml:space="preserve">    </w:t>
+      </w:r>
+      <w:proofErr w:type="spellStart"/>
+      <w:proofErr w:type="gramStart"/>
+      <w:r>
+        <w:rPr>
+          <w:sz w:val="20"/>
+          <w:szCs w:val="20"/>
+        </w:rPr>
+        <w:t>SingletonGameSetting</w:t>
+      </w:r>
+      <w:proofErr w:type="spellEnd"/>
+      <w:r>
+        <w:rPr>
+          <w:sz w:val="20"/>
+          <w:szCs w:val="20"/>
+        </w:rPr>
+        <w:t>(</w:t>
+      </w:r>
+      <w:proofErr w:type="spellStart"/>
+      <w:proofErr w:type="gramEnd"/>
+      <w:r>
+        <w:rPr>
+          <w:sz w:val="20"/>
+          <w:szCs w:val="20"/>
+        </w:rPr>
+        <w:t>const</w:t>
+      </w:r>
+      <w:proofErr w:type="spellEnd"/>
+      <w:r>
+        <w:rPr>
+          <w:sz w:val="20"/>
+          <w:szCs w:val="20"/>
+        </w:rPr>
+        <w:t xml:space="preserve"> </w:t>
+      </w:r>
+      <w:proofErr w:type="spellStart"/>
+      <w:r>
+        <w:rPr>
+          <w:sz w:val="20"/>
+          <w:szCs w:val="20"/>
+        </w:rPr>
+        <w:t>SingletonGameSetting</w:t>
+      </w:r>
+      <w:proofErr w:type="spellEnd"/>
+      <w:r>
+        <w:rPr>
+          <w:sz w:val="20"/>
+          <w:szCs w:val="20"/>
+        </w:rPr>
+        <w:t>&amp;) = delete;</w:t>
+      </w:r>
+    </w:p>
+    <w:p>
+      <w:pPr>
+        <w:spacing w:after="0" w:line="240" w:lineRule="auto"/>
+        <w:ind w:firstLine="360"/>
+        <w:rPr>
+          <w:sz w:val="20"/>
+          <w:szCs w:val="20"/>
+        </w:rPr>
+      </w:pPr>
+      <w:r>
+        <w:rPr>
+          <w:sz w:val="20"/>
+          <w:szCs w:val="20"/>
+        </w:rPr>
+        <w:t xml:space="preserve">    </w:t>
+      </w:r>
+      <w:proofErr w:type="spellStart"/>
+      <w:r>
+        <w:rPr>
+          <w:sz w:val="20"/>
+          <w:szCs w:val="20"/>
+        </w:rPr>
+        <w:t>SingletonGameSetting</w:t>
+      </w:r>
+      <w:proofErr w:type="spellEnd"/>
+      <w:r>
+        <w:rPr>
+          <w:sz w:val="20"/>
+          <w:szCs w:val="20"/>
+        </w:rPr>
+        <w:t>&amp; operator</w:t>
+      </w:r>
+      <w:proofErr w:type="gramStart"/>
+      <w:r>
+        <w:rPr>
+          <w:sz w:val="20"/>
+          <w:szCs w:val="20"/>
+        </w:rPr>
+        <w:t>=(</w:t>
+      </w:r>
+      <w:proofErr w:type="spellStart"/>
+      <w:proofErr w:type="gramEnd"/>
+      <w:r>
+        <w:rPr>
+          <w:sz w:val="20"/>
+          <w:szCs w:val="20"/>
+        </w:rPr>
+        <w:t>const</w:t>
+      </w:r>
+      <w:proofErr w:type="spellEnd"/>
+      <w:r>
+        <w:rPr>
+          <w:sz w:val="20"/>
+          <w:szCs w:val="20"/>
+        </w:rPr>
+        <w:t xml:space="preserve"> </w:t>
+      </w:r>
+      <w:proofErr w:type="spellStart"/>
+      <w:r>
+        <w:rPr>
+          <w:sz w:val="20"/>
+          <w:szCs w:val="20"/>
+        </w:rPr>
+        <w:t>SingletonGameSetting</w:t>
+      </w:r>
+      <w:proofErr w:type="spellEnd"/>
+      <w:r>
+        <w:rPr>
+          <w:sz w:val="20"/>
+          <w:szCs w:val="20"/>
+        </w:rPr>
+        <w:t>&amp;) = delete;</w:t>
+      </w:r>
+    </w:p>
+    <w:p>
+      <w:pPr>
+        <w:spacing w:after="0" w:line="240" w:lineRule="auto"/>
+        <w:ind w:firstLine="360"/>
+        <w:rPr>
+          <w:sz w:val="20"/>
+          <w:szCs w:val="20"/>
+        </w:rPr>
+      </w:pPr>
+      <w:r>
+        <w:rPr>
+          <w:sz w:val="20"/>
+          <w:szCs w:val="20"/>
+        </w:rPr>
+        <w:t xml:space="preserve">    </w:t>
+      </w:r>
+      <w:proofErr w:type="spellStart"/>
+      <w:proofErr w:type="gramStart"/>
+      <w:r>
+        <w:rPr>
+          <w:sz w:val="20"/>
+          <w:szCs w:val="20"/>
+        </w:rPr>
+        <w:t>SingletonGameSetting</w:t>
+      </w:r>
+      <w:proofErr w:type="spellEnd"/>
+      <w:r>
+        <w:rPr>
+          <w:sz w:val="20"/>
+          <w:szCs w:val="20"/>
+        </w:rPr>
+        <w:t>(</w:t>
+      </w:r>
+      <w:proofErr w:type="spellStart"/>
+      <w:proofErr w:type="gramEnd"/>
+      <w:r>
+        <w:rPr>
+          <w:sz w:val="20"/>
+          <w:szCs w:val="20"/>
+        </w:rPr>
+        <w:t>SingletonGameSetting</w:t>
+      </w:r>
+      <w:proofErr w:type="spellEnd"/>
+      <w:r>
+        <w:rPr>
+          <w:sz w:val="20"/>
+          <w:szCs w:val="20"/>
+        </w:rPr>
+        <w:t>&amp;&amp;) = delete;</w:t>
+      </w:r>
+    </w:p>
+    <w:p>
+      <w:pPr>
+        <w:spacing w:after="0" w:line="240" w:lineRule="auto"/>
+        <w:ind w:firstLine="360"/>
+        <w:rPr>
+          <w:sz w:val="20"/>
+          <w:szCs w:val="20"/>
+        </w:rPr>
+      </w:pPr>
+      <w:r>
+        <w:rPr>
+          <w:sz w:val="20"/>
+          <w:szCs w:val="20"/>
+        </w:rPr>
+        <w:t xml:space="preserve">    </w:t>
+      </w:r>
+      <w:proofErr w:type="spellStart"/>
+      <w:r>
+        <w:rPr>
+          <w:sz w:val="20"/>
+          <w:szCs w:val="20"/>
+        </w:rPr>
+        <w:t>SingletonGameSetting</w:t>
+      </w:r>
+      <w:proofErr w:type="spellEnd"/>
+      <w:r>
+        <w:rPr>
+          <w:sz w:val="20"/>
+          <w:szCs w:val="20"/>
+        </w:rPr>
+        <w:t>&amp; operator=(</w:t>
+      </w:r>
+      <w:proofErr w:type="spellStart"/>
+      <w:r>
+        <w:rPr>
+          <w:sz w:val="20"/>
+          <w:szCs w:val="20"/>
+        </w:rPr>
+        <w:t>SingletonGameSetting</w:t>
+      </w:r>
+      <w:proofErr w:type="spellEnd"/>
+      <w:r>
+        <w:rPr>
+          <w:sz w:val="20"/>
+          <w:szCs w:val="20"/>
+        </w:rPr>
+        <w:t>&amp;&amp;) = delete;</w:t>
+      </w:r>
+    </w:p>
+    <w:p>
+      <w:pPr>
+        <w:spacing w:after="0" w:line="240" w:lineRule="auto"/>
+        <w:ind w:firstLine="360"/>
+        <w:rPr>
+          <w:sz w:val="20"/>
+          <w:szCs w:val="20"/>
+        </w:rPr>
+      </w:pPr>
+    </w:p>
+    <w:p>
+      <w:pPr>
+        <w:spacing w:after="0" w:line="240" w:lineRule="auto"/>
+        <w:ind w:firstLine="360"/>
+        <w:rPr>
+          <w:sz w:val="20"/>
+          <w:szCs w:val="20"/>
+        </w:rPr>
+      </w:pPr>
+    </w:p>
+    <w:p>
+      <w:pPr>
+        <w:spacing w:after="0" w:line="240" w:lineRule="auto"/>
+        <w:ind w:firstLine="360"/>
+        <w:rPr>
+          <w:b/>
+          <w:bCs/>
+          <w:sz w:val="20"/>
+          <w:szCs w:val="20"/>
+        </w:rPr>
+      </w:pPr>
+      <w:r>
+        <w:rPr>
+          <w:b/>
+          <w:bCs/>
+          <w:sz w:val="20"/>
+          <w:szCs w:val="20"/>
+        </w:rPr>
+        <w:t>Why is this better?</w:t>
+      </w:r>
+    </w:p>
+    <w:p>
+      <w:pPr>
+        <w:numPr>
+          <w:ilvl w:val="0"/>
+          <w:numId w:val="8"/>
+        </w:numPr>
+        <w:spacing w:after="0" w:line="240" w:lineRule="auto"/>
+        <w:rPr>
+          <w:sz w:val="20"/>
+          <w:szCs w:val="20"/>
+        </w:rPr>
+      </w:pPr>
+      <w:r>
+        <w:rPr>
+          <w:b/>
+          <w:bCs/>
+          <w:sz w:val="20"/>
+          <w:szCs w:val="20"/>
+        </w:rPr>
+        <w:t>No manual mutex</w:t>
+      </w:r>
+      <w:r>
+        <w:rPr>
+          <w:sz w:val="20"/>
+          <w:szCs w:val="20"/>
+        </w:rPr>
+        <w:t xml:space="preserve"> needed — C++11 guarantees that static local variables are initialized only once, even in multithreaded programs.</w:t>
+      </w:r>
+    </w:p>
+    <w:p>
+      <w:pPr>
+        <w:numPr>
+          <w:ilvl w:val="0"/>
+          <w:numId w:val="8"/>
+        </w:numPr>
+        <w:spacing w:after="0" w:line="240" w:lineRule="auto"/>
+        <w:rPr>
+          <w:sz w:val="20"/>
+          <w:szCs w:val="20"/>
+        </w:rPr>
+      </w:pPr>
+      <w:r>
+        <w:rPr>
+          <w:b/>
+          <w:bCs/>
+          <w:sz w:val="20"/>
+          <w:szCs w:val="20"/>
+        </w:rPr>
+        <w:t>No memory leaks</w:t>
+      </w:r>
+      <w:r>
+        <w:rPr>
+          <w:sz w:val="20"/>
+          <w:szCs w:val="20"/>
+        </w:rPr>
+        <w:t xml:space="preserve"> — the instance is destroyed automatically when the program ends.</w:t>
+      </w:r>
+    </w:p>
+    <w:p>
+      <w:pPr>
+        <w:numPr>
+          <w:ilvl w:val="0"/>
+          <w:numId w:val="8"/>
+        </w:numPr>
+        <w:spacing w:after="0" w:line="240" w:lineRule="auto"/>
+        <w:rPr>
+          <w:sz w:val="20"/>
+          <w:szCs w:val="20"/>
+        </w:rPr>
+      </w:pPr>
+      <w:r>
+        <w:rPr>
+          <w:b/>
+          <w:bCs/>
+          <w:sz w:val="20"/>
+          <w:szCs w:val="20"/>
+        </w:rPr>
+        <w:t>Cleaner code</w:t>
+      </w:r>
+      <w:r>
+        <w:rPr>
+          <w:sz w:val="20"/>
+          <w:szCs w:val="20"/>
+        </w:rPr>
+        <w:t xml:space="preserve"> — fewer moving parts, no double-checked locking mess.</w:t>
+      </w:r>
+    </w:p>
+    <w:p>
+      <w:pPr>
+        <w:rPr>
+          <w:sz w:val="20"/>
+          <w:szCs w:val="20"/>
+        </w:rPr>
+      </w:pPr>
+      <w:r>
+        <w:rPr>
+          <w:sz w:val="20"/>
+          <w:szCs w:val="20"/>
+        </w:rPr>
+        <w:br w:type="page"/>
+      </w:r>
+    </w:p>
+    <w:p>
+      <w:pPr>
+        <w:pStyle w:val="ListParagraph"/>
+        <w:numPr>
+          <w:ilvl w:val="0"/>
+          <w:numId w:val="2"/>
+        </w:numPr>
+      </w:pPr>
+      <w:r>
+        <w:lastRenderedPageBreak/>
+        <w:t>Singleton</w:t>
+      </w:r>
+      <w:r>
+        <w:t xml:space="preserve"> design pattern</w:t>
+      </w:r>
+      <w:r>
+        <w:t xml:space="preserve"> (</w:t>
+      </w:r>
+      <w:r>
+        <w:t>O</w:t>
+      </w:r>
+      <w:r>
+        <w:t>DP):</w:t>
+      </w:r>
+    </w:p>
+    <w:p>
+      <w:pPr>
+        <w:pStyle w:val="ListParagraph"/>
+        <w:numPr>
+          <w:ilvl w:val="1"/>
+          <w:numId w:val="2"/>
+        </w:numPr>
+      </w:pPr>
+      <w:r>
+        <w:t>Observe state change and initiate the action</w:t>
+      </w:r>
+    </w:p>
+    <w:p>
+      <w:pPr>
+        <w:pStyle w:val="ListParagraph"/>
+        <w:numPr>
+          <w:ilvl w:val="1"/>
+          <w:numId w:val="2"/>
+        </w:numPr>
+      </w:pPr>
+      <w:r>
+        <w:t>One to Many relationship</w:t>
+      </w:r>
+    </w:p>
+    <w:p>
+      <w:pPr>
+        <w:pStyle w:val="ListParagraph"/>
+        <w:numPr>
+          <w:ilvl w:val="1"/>
+          <w:numId w:val="2"/>
+        </w:numPr>
       </w:pPr>
     </w:p>
     <w:sectPr>
@@ -10644,6 +14252,123 @@
 <file path=word/numbering.xml><?xml version="1.0" encoding="utf-8"?>
 <w:numbering xmlns:wpc="http://schemas.microsoft.com/office/word/2010/wordprocessingCanvas" xmlns:cx="http://schemas.microsoft.com/office/drawing/2014/chartex" xmlns:cx1="http://schemas.microsoft.com/office/drawing/2015/9/8/chartex" xmlns:cx2="http://schemas.microsoft.com/office/drawing/2015/10/21/chartex" xmlns:cx3="http://schemas.microsoft.com/office/drawing/2016/5/9/chartex" xmlns:cx4="http://schemas.microsoft.com/office/drawing/2016/5/10/chartex" xmlns:cx5="http://schemas.microsoft.com/office/drawing/2016/5/11/chartex" xmlns:cx6="http://schemas.microsoft.com/office/drawing/2016/5/12/chartex" xmlns:cx7="http://schemas.microsoft.com/office/drawing/2016/5/13/chartex" xmlns:cx8="http://schemas.microsoft.com/office/drawing/2016/5/14/chartex" xmlns:mc="http://schemas.openxmlformats.org/markup-compatibility/2006" xmlns:aink="http://schemas.microsoft.com/office/drawing/2016/ink" xmlns:am3d="http://schemas.microsoft.com/office/drawing/2017/model3d" xmlns:o="urn:schemas-microsoft-com:office:office" xmlns:oel="http://schemas.microsoft.com/office/2019/extlst" xmlns:r="http://schemas.openxmlformats.org/officeDocument/2006/relationships" xmlns:m="http://schemas.openxmlformats.org/officeDocument/2006/math" xmlns:v="urn:schemas-microsoft-com:vml" xmlns:wp14="http://schemas.microsoft.com/office/word/2010/wordprocessingDrawing" xmlns:wp="http://schemas.openxmlformats.org/drawingml/2006/wordprocessingDrawing" xmlns:w10="urn:schemas-microsoft-com:office:word" xmlns:w="http://schemas.openxmlformats.org/wordprocessingml/2006/main" xmlns:w14="http://schemas.microsoft.com/office/word/2010/wordml" xmlns:w15="http://schemas.microsoft.com/office/word/2012/wordml" xmlns:w16cex="http://schemas.microsoft.com/office/word/2018/wordml/cex" xmlns:w16cid="http://schemas.microsoft.com/office/word/2016/wordml/cid" xmlns:w16="http://schemas.microsoft.com/office/word/2018/wordml" xmlns:w16du="http://schemas.microsoft.com/office/word/2023/wordml/word16du" xmlns:w16sdtdh="http://schemas.microsoft.com/office/word/2020/wordml/sdtdatahash" xmlns:w16sdtfl="http://schemas.microsoft.com/office/word/2024/wordml/sdtformatlock" xmlns:w16se="http://schemas.microsoft.com/office/word/2015/wordml/symex" xmlns:wpg="http://schemas.microsoft.com/office/word/2010/wordprocessingGroup" xmlns:wpi="http://schemas.microsoft.com/office/word/2010/wordprocessingInk" xmlns:wne="http://schemas.microsoft.com/office/word/2006/wordml" xmlns:wps="http://schemas.microsoft.com/office/word/2010/wordprocessingShape" mc:Ignorable="w14 w15 w16se w16cid w16 w16cex w16sdtdh w16sdtfl w16du wp14">
   <w:abstractNum w:abstractNumId="0" w15:restartNumberingAfterBreak="0">
+    <w:nsid w:val="0D407421"/>
+    <w:multiLevelType w:val="multilevel"/>
+    <w:tmpl w:val="B64E4528"/>
+    <w:lvl w:ilvl="0">
+      <w:start w:val="1"/>
+      <w:numFmt w:val="decimal"/>
+      <w:lvlText w:val="%1."/>
+      <w:lvlJc w:val="left"/>
+      <w:pPr>
+        <w:tabs>
+          <w:tab w:val="num" w:pos="720"/>
+        </w:tabs>
+        <w:ind w:left="720" w:hanging="360"/>
+      </w:pPr>
+    </w:lvl>
+    <w:lvl w:ilvl="1">
+      <w:start w:val="1"/>
+      <w:numFmt w:val="bullet"/>
+      <w:lvlText w:val="o"/>
+      <w:lvlJc w:val="left"/>
+      <w:pPr>
+        <w:tabs>
+          <w:tab w:val="num" w:pos="1440"/>
+        </w:tabs>
+        <w:ind w:left="1440" w:hanging="360"/>
+      </w:pPr>
+      <w:rPr>
+        <w:rFonts w:ascii="Courier New" w:hAnsi="Courier New" w:hint="default"/>
+        <w:sz w:val="20"/>
+      </w:rPr>
+    </w:lvl>
+    <w:lvl w:ilvl="2" w:tentative="1">
+      <w:start w:val="1"/>
+      <w:numFmt w:val="decimal"/>
+      <w:lvlText w:val="%3."/>
+      <w:lvlJc w:val="left"/>
+      <w:pPr>
+        <w:tabs>
+          <w:tab w:val="num" w:pos="2160"/>
+        </w:tabs>
+        <w:ind w:left="2160" w:hanging="360"/>
+      </w:pPr>
+    </w:lvl>
+    <w:lvl w:ilvl="3" w:tentative="1">
+      <w:start w:val="1"/>
+      <w:numFmt w:val="decimal"/>
+      <w:lvlText w:val="%4."/>
+      <w:lvlJc w:val="left"/>
+      <w:pPr>
+        <w:tabs>
+          <w:tab w:val="num" w:pos="2880"/>
+        </w:tabs>
+        <w:ind w:left="2880" w:hanging="360"/>
+      </w:pPr>
+    </w:lvl>
+    <w:lvl w:ilvl="4" w:tentative="1">
+      <w:start w:val="1"/>
+      <w:numFmt w:val="decimal"/>
+      <w:lvlText w:val="%5."/>
+      <w:lvlJc w:val="left"/>
+      <w:pPr>
+        <w:tabs>
+          <w:tab w:val="num" w:pos="3600"/>
+        </w:tabs>
+        <w:ind w:left="3600" w:hanging="360"/>
+      </w:pPr>
+    </w:lvl>
+    <w:lvl w:ilvl="5" w:tentative="1">
+      <w:start w:val="1"/>
+      <w:numFmt w:val="decimal"/>
+      <w:lvlText w:val="%6."/>
+      <w:lvlJc w:val="left"/>
+      <w:pPr>
+        <w:tabs>
+          <w:tab w:val="num" w:pos="4320"/>
+        </w:tabs>
+        <w:ind w:left="4320" w:hanging="360"/>
+      </w:pPr>
+    </w:lvl>
+    <w:lvl w:ilvl="6" w:tentative="1">
+      <w:start w:val="1"/>
+      <w:numFmt w:val="decimal"/>
+      <w:lvlText w:val="%7."/>
+      <w:lvlJc w:val="left"/>
+      <w:pPr>
+        <w:tabs>
+          <w:tab w:val="num" w:pos="5040"/>
+        </w:tabs>
+        <w:ind w:left="5040" w:hanging="360"/>
+      </w:pPr>
+    </w:lvl>
+    <w:lvl w:ilvl="7" w:tentative="1">
+      <w:start w:val="1"/>
+      <w:numFmt w:val="decimal"/>
+      <w:lvlText w:val="%8."/>
+      <w:lvlJc w:val="left"/>
+      <w:pPr>
+        <w:tabs>
+          <w:tab w:val="num" w:pos="5760"/>
+        </w:tabs>
+        <w:ind w:left="5760" w:hanging="360"/>
+      </w:pPr>
+    </w:lvl>
+    <w:lvl w:ilvl="8" w:tentative="1">
+      <w:start w:val="1"/>
+      <w:numFmt w:val="decimal"/>
+      <w:lvlText w:val="%9."/>
+      <w:lvlJc w:val="left"/>
+      <w:pPr>
+        <w:tabs>
+          <w:tab w:val="num" w:pos="6480"/>
+        </w:tabs>
+        <w:ind w:left="6480" w:hanging="360"/>
+      </w:pPr>
+    </w:lvl>
+  </w:abstractNum>
+  <w:abstractNum w:abstractNumId="1" w15:restartNumberingAfterBreak="0">
     <w:nsid w:val="2C1600AB"/>
     <w:multiLevelType w:val="hybridMultilevel"/>
     <w:tmpl w:val="A3AC955E"/>
@@ -10756,7 +14481,7 @@
       </w:rPr>
     </w:lvl>
   </w:abstractNum>
-  <w:abstractNum w:abstractNumId="1" w15:restartNumberingAfterBreak="0">
+  <w:abstractNum w:abstractNumId="2" w15:restartNumberingAfterBreak="0">
     <w:nsid w:val="2EEE1393"/>
     <w:multiLevelType w:val="hybridMultilevel"/>
     <w:tmpl w:val="572ED4E0"/>
@@ -10868,7 +14593,7 @@
       </w:rPr>
     </w:lvl>
   </w:abstractNum>
-  <w:abstractNum w:abstractNumId="2" w15:restartNumberingAfterBreak="0">
+  <w:abstractNum w:abstractNumId="3" w15:restartNumberingAfterBreak="0">
     <w:nsid w:val="3B17177E"/>
     <w:multiLevelType w:val="multilevel"/>
     <w:tmpl w:val="D33A0BAC"/>
@@ -11017,7 +14742,7 @@
       </w:rPr>
     </w:lvl>
   </w:abstractNum>
-  <w:abstractNum w:abstractNumId="3" w15:restartNumberingAfterBreak="0">
+  <w:abstractNum w:abstractNumId="4" w15:restartNumberingAfterBreak="0">
     <w:nsid w:val="3EBB56DC"/>
     <w:multiLevelType w:val="hybridMultilevel"/>
     <w:tmpl w:val="01BE0EC0"/>
@@ -11130,7 +14855,120 @@
       </w:rPr>
     </w:lvl>
   </w:abstractNum>
-  <w:abstractNum w:abstractNumId="4" w15:restartNumberingAfterBreak="0">
+  <w:abstractNum w:abstractNumId="5" w15:restartNumberingAfterBreak="0">
+    <w:nsid w:val="4AB70B3A"/>
+    <w:multiLevelType w:val="multilevel"/>
+    <w:tmpl w:val="B8A4E6FA"/>
+    <w:lvl w:ilvl="0">
+      <w:start w:val="1"/>
+      <w:numFmt w:val="decimal"/>
+      <w:lvlText w:val="%1."/>
+      <w:lvlJc w:val="left"/>
+      <w:pPr>
+        <w:tabs>
+          <w:tab w:val="num" w:pos="720"/>
+        </w:tabs>
+        <w:ind w:left="720" w:hanging="360"/>
+      </w:pPr>
+    </w:lvl>
+    <w:lvl w:ilvl="1" w:tentative="1">
+      <w:start w:val="1"/>
+      <w:numFmt w:val="decimal"/>
+      <w:lvlText w:val="%2."/>
+      <w:lvlJc w:val="left"/>
+      <w:pPr>
+        <w:tabs>
+          <w:tab w:val="num" w:pos="1440"/>
+        </w:tabs>
+        <w:ind w:left="1440" w:hanging="360"/>
+      </w:pPr>
+    </w:lvl>
+    <w:lvl w:ilvl="2" w:tentative="1">
+      <w:start w:val="1"/>
+      <w:numFmt w:val="decimal"/>
+      <w:lvlText w:val="%3."/>
+      <w:lvlJc w:val="left"/>
+      <w:pPr>
+        <w:tabs>
+          <w:tab w:val="num" w:pos="2160"/>
+        </w:tabs>
+        <w:ind w:left="2160" w:hanging="360"/>
+      </w:pPr>
+    </w:lvl>
+    <w:lvl w:ilvl="3" w:tentative="1">
+      <w:start w:val="1"/>
+      <w:numFmt w:val="decimal"/>
+      <w:lvlText w:val="%4."/>
+      <w:lvlJc w:val="left"/>
+      <w:pPr>
+        <w:tabs>
+          <w:tab w:val="num" w:pos="2880"/>
+        </w:tabs>
+        <w:ind w:left="2880" w:hanging="360"/>
+      </w:pPr>
+    </w:lvl>
+    <w:lvl w:ilvl="4" w:tentative="1">
+      <w:start w:val="1"/>
+      <w:numFmt w:val="decimal"/>
+      <w:lvlText w:val="%5."/>
+      <w:lvlJc w:val="left"/>
+      <w:pPr>
+        <w:tabs>
+          <w:tab w:val="num" w:pos="3600"/>
+        </w:tabs>
+        <w:ind w:left="3600" w:hanging="360"/>
+      </w:pPr>
+    </w:lvl>
+    <w:lvl w:ilvl="5" w:tentative="1">
+      <w:start w:val="1"/>
+      <w:numFmt w:val="decimal"/>
+      <w:lvlText w:val="%6."/>
+      <w:lvlJc w:val="left"/>
+      <w:pPr>
+        <w:tabs>
+          <w:tab w:val="num" w:pos="4320"/>
+        </w:tabs>
+        <w:ind w:left="4320" w:hanging="360"/>
+      </w:pPr>
+    </w:lvl>
+    <w:lvl w:ilvl="6" w:tentative="1">
+      <w:start w:val="1"/>
+      <w:numFmt w:val="decimal"/>
+      <w:lvlText w:val="%7."/>
+      <w:lvlJc w:val="left"/>
+      <w:pPr>
+        <w:tabs>
+          <w:tab w:val="num" w:pos="5040"/>
+        </w:tabs>
+        <w:ind w:left="5040" w:hanging="360"/>
+      </w:pPr>
+    </w:lvl>
+    <w:lvl w:ilvl="7" w:tentative="1">
+      <w:start w:val="1"/>
+      <w:numFmt w:val="decimal"/>
+      <w:lvlText w:val="%8."/>
+      <w:lvlJc w:val="left"/>
+      <w:pPr>
+        <w:tabs>
+          <w:tab w:val="num" w:pos="5760"/>
+        </w:tabs>
+        <w:ind w:left="5760" w:hanging="360"/>
+      </w:pPr>
+    </w:lvl>
+    <w:lvl w:ilvl="8" w:tentative="1">
+      <w:start w:val="1"/>
+      <w:numFmt w:val="decimal"/>
+      <w:lvlText w:val="%9."/>
+      <w:lvlJc w:val="left"/>
+      <w:pPr>
+        <w:tabs>
+          <w:tab w:val="num" w:pos="6480"/>
+        </w:tabs>
+        <w:ind w:left="6480" w:hanging="360"/>
+      </w:pPr>
+    </w:lvl>
+  </w:abstractNum>
+  <w:abstractNum w:abstractNumId="6" w15:restartNumberingAfterBreak="0">
     <w:nsid w:val="66BF02C8"/>
     <w:multiLevelType w:val="multilevel"/>
     <w:tmpl w:val="BDE6997A"/>
@@ -11279,7 +15117,7 @@
       </w:rPr>
     </w:lvl>
   </w:abstractNum>
-  <w:abstractNum w:abstractNumId="5" w15:restartNumberingAfterBreak="0">
+  <w:abstractNum w:abstractNumId="7" w15:restartNumberingAfterBreak="0">
     <w:nsid w:val="6CF4136F"/>
     <w:multiLevelType w:val="multilevel"/>
     <w:tmpl w:val="9FE0D3F0"/>
@@ -11429,22 +15267,28 @@
     </w:lvl>
   </w:abstractNum>
   <w:num w:numId="1" w16cid:durableId="607204947">
+    <w:abstractNumId w:val="4"/>
+  </w:num>
+  <w:num w:numId="2" w16cid:durableId="591086867">
+    <w:abstractNumId w:val="1"/>
+  </w:num>
+  <w:num w:numId="3" w16cid:durableId="380204072">
+    <w:abstractNumId w:val="7"/>
+  </w:num>
+  <w:num w:numId="4" w16cid:durableId="607851218">
+    <w:abstractNumId w:val="6"/>
+  </w:num>
+  <w:num w:numId="5" w16cid:durableId="353579955">
     <w:abstractNumId w:val="3"/>
   </w:num>
-  <w:num w:numId="2" w16cid:durableId="591086867">
+  <w:num w:numId="6" w16cid:durableId="824858514">
+    <w:abstractNumId w:val="2"/>
+  </w:num>
+  <w:num w:numId="7" w16cid:durableId="1357461499">
     <w:abstractNumId w:val="0"/>
   </w:num>
-  <w:num w:numId="3" w16cid:durableId="380204072">
+  <w:num w:numId="8" w16cid:durableId="1537740822">
     <w:abstractNumId w:val="5"/>
-  </w:num>
-  <w:num w:numId="4" w16cid:durableId="607851218">
-    <w:abstractNumId w:val="4"/>
-  </w:num>
-  <w:num w:numId="5" w16cid:durableId="353579955">
-    <w:abstractNumId w:val="2"/>
-  </w:num>
-  <w:num w:numId="6" w16cid:durableId="824858514">
-    <w:abstractNumId w:val="1"/>
   </w:num>
 </w:numbering>
 </file>

</xml_diff>